<commit_message>
Expand team walkthrough for a non-security audience
Rewrite docs/TEAM_WALKTHROUGH with a plain-language crash course (what
DFIR, NTFS, the MFT, the two timestamp sets, the change journal, pcap,
encryption, timestomping and exfiltration are) and a detailed, elaborated
part for each presenter. Each part now explains the concept from scratch,
why it matters to the project, exactly which files and functions implement
it, a script, an analogy, and likely questions, plus a file-to-person
appendix. Regenerated the docx and pdf (now 9 pages).

Co-Authored-By: Claude Opus 4.8 <noreply@anthropic.com>
</commit_message>
<xml_diff>
--- a/docs/TEAM_WALKTHROUGH.docx
+++ b/docs/TEAM_WALKTHROUGH.docx
@@ -7,7 +7,7 @@
         <w:pStyle w:val="Title"/>
       </w:pPr>
       <w:r>
-        <w:t>CTRE: Team Walkthrough</w:t>
+        <w:t>CTRE - Team Walkthrough (Detailed)</w:t>
       </w:r>
     </w:p>
     <w:p>
@@ -15,7 +15,7 @@
         <w:rPr>
           <w:b w:val="0"/>
         </w:rPr>
-        <w:t>A guide for explaining the Cyber Threat Reconstruction Engine as a group. The project is split into four parts, one per presenter. Each part has the points to make, a short script, and the questions you are likely to get.</w:t>
+        <w:t>A complete guide for explaining the Cyber Threat Reconstruction Engine (CTRE) as a group, written for people who are new to cybersecurity. It starts with a plain-language crash course that everyone should read together, then gives each presenter a detailed part: what the idea is, why it matters to the project, what the code actually does and in which files, a script to say out loud, an analogy, and the questions you are likely to get.</w:t>
       </w:r>
     </w:p>
     <w:p>
@@ -57,7 +57,224 @@
         <w:rPr>
           <w:b w:val="0"/>
         </w:rPr>
-        <w:t xml:space="preserve">: disk forensics: </w:t>
+        <w:t>: disk forensics - reading the file system and catching fake timestamps (Part 2)</w:t>
+      </w:r>
+    </w:p>
+    <w:p>
+      <w:pPr>
+        <w:pStyle w:val="ListBullet"/>
+      </w:pPr>
+      <w:r>
+        <w:rPr>
+          <w:b/>
+        </w:rPr>
+        <w:t>Moksh</w:t>
+      </w:r>
+      <w:r>
+        <w:rPr>
+          <w:b w:val="0"/>
+        </w:rPr>
+        <w:t>: network evidence - reading traffic without decrypting it, and connecting it to the disk (Part 3)</w:t>
+      </w:r>
+    </w:p>
+    <w:p>
+      <w:pPr>
+        <w:pStyle w:val="ListBullet"/>
+      </w:pPr>
+      <w:r>
+        <w:rPr>
+          <w:b/>
+        </w:rPr>
+        <w:t>Aranck</w:t>
+      </w:r>
+      <w:r>
+        <w:rPr>
+          <w:b w:val="0"/>
+        </w:rPr>
+        <w:t>: the app, testing, safety, and results (Part 4)</w:t>
+      </w:r>
+    </w:p>
+    <w:p>
+      <w:r>
+        <w:rPr>
+          <w:b w:val="0"/>
+        </w:rPr>
+        <w:t>Suggested order: everyone presents the crash course idea they need, Vivek sets up the problem and the architecture, Kshitij and Moksh explain the two halves of the analysis, and Aranck shows it running and reports what it found.</w:t>
+      </w:r>
+    </w:p>
+    <w:p>
+      <w:pPr>
+        <w:pBdr>
+          <w:bottom w:val="single" w:sz="6" w:space="1" w:color="999999"/>
+        </w:pBdr>
+      </w:pPr>
+    </w:p>
+    <w:p>
+      <w:pPr>
+        <w:pStyle w:val="Heading1"/>
+      </w:pPr>
+      <w:r>
+        <w:t>Part 0: Crash course (read this first, together)</w:t>
+      </w:r>
+    </w:p>
+    <w:p>
+      <w:r>
+        <w:rPr>
+          <w:b w:val="0"/>
+        </w:rPr>
+        <w:t>You do not need a security background to present this project. You need about ten ideas. Here they are in plain language.</w:t>
+      </w:r>
+    </w:p>
+    <w:p>
+      <w:pPr>
+        <w:pStyle w:val="Heading2"/>
+      </w:pPr>
+      <w:r>
+        <w:t>What is digital forensics and incident response?</w:t>
+      </w:r>
+    </w:p>
+    <w:p>
+      <w:r>
+        <w:rPr>
+          <w:b w:val="0"/>
+        </w:rPr>
+        <w:t>When a computer is attacked or misused, investigators try to work out what happened: what got in, what it did, and whether anything was taken. This is "digital forensics." Doing it during or just after an attack is "incident response," often shortened to DFIR. The investigator does not work on the live, running machine, because that could destroy evidence. Instead they take copies of the important data and study the copies. CTRE is a tool that studies those copies.</w:t>
+      </w:r>
+    </w:p>
+    <w:p>
+      <w:pPr>
+        <w:pStyle w:val="Heading2"/>
+      </w:pPr>
+      <w:r>
+        <w:t>The three kinds of evidence we use</w:t>
+      </w:r>
+    </w:p>
+    <w:p>
+      <w:r>
+        <w:rPr>
+          <w:b w:val="0"/>
+        </w:rPr>
+        <w:t>An attack leaves marks in more than one place:</w:t>
+      </w:r>
+    </w:p>
+    <w:p>
+      <w:pPr>
+        <w:pStyle w:val="ListBullet"/>
+      </w:pPr>
+      <w:r>
+        <w:rPr>
+          <w:b/>
+        </w:rPr>
+        <w:t>The file system</w:t>
+      </w:r>
+      <w:r>
+        <w:rPr>
+          <w:b w:val="0"/>
+        </w:rPr>
+        <w:t xml:space="preserve"> (the disk): new files appear, old ones change.</w:t>
+      </w:r>
+    </w:p>
+    <w:p>
+      <w:pPr>
+        <w:pStyle w:val="ListBullet"/>
+      </w:pPr>
+      <w:r>
+        <w:rPr>
+          <w:b/>
+        </w:rPr>
+        <w:t>The file system's own logbook</w:t>
+      </w:r>
+      <w:r>
+        <w:rPr>
+          <w:b w:val="0"/>
+        </w:rPr>
+        <w:t xml:space="preserve"> (a journal): the operating system writes down each change as it happens.</w:t>
+      </w:r>
+    </w:p>
+    <w:p>
+      <w:pPr>
+        <w:pStyle w:val="ListBullet"/>
+      </w:pPr>
+      <w:r>
+        <w:rPr>
+          <w:b/>
+        </w:rPr>
+        <w:t>The network capture</w:t>
+      </w:r>
+      <w:r>
+        <w:rPr>
+          <w:b w:val="0"/>
+        </w:rPr>
+        <w:t>: a recording of the traffic that went in and out of the machine.</w:t>
+      </w:r>
+    </w:p>
+    <w:p>
+      <w:r>
+        <w:rPr>
+          <w:b w:val="0"/>
+        </w:rPr>
+        <w:t>Normally each of these is opened in a different tool, and a human tries to line them up by hand. That is slow and easy to get wrong. CTRE reads all three together.</w:t>
+      </w:r>
+    </w:p>
+    <w:p>
+      <w:pPr>
+        <w:pStyle w:val="Heading2"/>
+      </w:pPr>
+      <w:r>
+        <w:t>What is NTFS, a file, and the MFT?</w:t>
+      </w:r>
+    </w:p>
+    <w:p>
+      <w:r>
+        <w:rPr>
+          <w:b w:val="0"/>
+        </w:rPr>
+        <w:t xml:space="preserve">NTFS is the file system Windows uses. A file system is the filing cabinet that keeps track of every file: its name, where its data lives, and when it was created or changed. In NTFS, the master index of that filing cabinet is called the </w:t>
+      </w:r>
+      <w:r>
+        <w:rPr>
+          <w:b/>
+        </w:rPr>
+        <w:t>MFT</w:t>
+      </w:r>
+      <w:r>
+        <w:rPr>
+          <w:b w:val="0"/>
+        </w:rPr>
+        <w:t xml:space="preserve"> (Master File Table). There is one entry in the MFT for every file, and that entry holds the file's timestamps.</w:t>
+      </w:r>
+    </w:p>
+    <w:p>
+      <w:pPr>
+        <w:pStyle w:val="Heading2"/>
+      </w:pPr>
+      <w:r>
+        <w:t>The two sets of timestamps (this is the key idea)</w:t>
+      </w:r>
+    </w:p>
+    <w:p>
+      <w:r>
+        <w:rPr>
+          <w:b w:val="0"/>
+        </w:rPr>
+        <w:t>Here is the single most important fact for this project. Windows stores a file's timestamps in two different places inside its MFT entry:</w:t>
+      </w:r>
+    </w:p>
+    <w:p>
+      <w:pPr>
+        <w:pStyle w:val="ListBullet"/>
+      </w:pPr>
+      <w:r>
+        <w:rPr>
+          <w:b/>
+        </w:rPr>
+        <w:t>SI</w:t>
+      </w:r>
+      <w:r>
+        <w:rPr>
+          <w:b w:val="0"/>
+        </w:rPr>
+        <w:t xml:space="preserve"> (short for </w:t>
       </w:r>
       <w:r>
         <w:rPr>
@@ -66,13 +283,42 @@
           <w:color w:val="1A534A"/>
           <w:sz w:val="20"/>
         </w:rPr>
-        <w:t>$MFT</w:t>
+        <w:t>$STANDARD_INFORMATION</w:t>
       </w:r>
       <w:r>
         <w:rPr>
           <w:b w:val="0"/>
         </w:rPr>
-        <w:t xml:space="preserve">, </w:t>
+        <w:t xml:space="preserve">): the times you see when you look at a file's properties. These are </w:t>
+      </w:r>
+      <w:r>
+        <w:rPr>
+          <w:b/>
+        </w:rPr>
+        <w:t>easy to change</w:t>
+      </w:r>
+      <w:r>
+        <w:rPr>
+          <w:b w:val="0"/>
+        </w:rPr>
+        <w:t xml:space="preserve"> with ordinary tools.</w:t>
+      </w:r>
+    </w:p>
+    <w:p>
+      <w:pPr>
+        <w:pStyle w:val="ListBullet"/>
+      </w:pPr>
+      <w:r>
+        <w:rPr>
+          <w:b/>
+        </w:rPr>
+        <w:t>FN</w:t>
+      </w:r>
+      <w:r>
+        <w:rPr>
+          <w:b w:val="0"/>
+        </w:rPr>
+        <w:t xml:space="preserve"> (short for </w:t>
       </w:r>
       <w:r>
         <w:rPr>
@@ -81,47 +327,41 @@
           <w:color w:val="1A534A"/>
           <w:sz w:val="20"/>
         </w:rPr>
-        <w:t>$UsnJrnl</w:t>
+        <w:t>$FILE_NAME</w:t>
       </w:r>
       <w:r>
         <w:rPr>
           <w:b w:val="0"/>
         </w:rPr>
-        <w:t>, and timestomping (Part 2)</w:t>
+        <w:t xml:space="preserve">): a second copy of the times, kept by the Windows kernel for its own use. These are </w:t>
+      </w:r>
+      <w:r>
+        <w:rPr>
+          <w:b/>
+        </w:rPr>
+        <w:t>hard to change</w:t>
+      </w:r>
+      <w:r>
+        <w:rPr>
+          <w:b w:val="0"/>
+        </w:rPr>
+        <w:t xml:space="preserve"> from normal programs.</w:t>
       </w:r>
     </w:p>
     <w:p>
-      <w:pPr>
-        <w:pStyle w:val="ListBullet"/>
-      </w:pPr>
-      <w:r>
-        <w:rPr>
-          <w:b/>
-        </w:rPr>
-        <w:t>Moksh</w:t>
-      </w:r>
       <w:r>
         <w:rPr>
           <w:b w:val="0"/>
         </w:rPr>
-        <w:t>: network metadata and correlation (Part 3)</w:t>
+        <w:t>So a file carries an "easy to fake" clock and a "hard to fake" clock. If the two disagree, something altered the easy one. That disagreement is what we hunt for.</w:t>
       </w:r>
     </w:p>
     <w:p>
       <w:pPr>
-        <w:pStyle w:val="ListBullet"/>
-      </w:pPr>
-      <w:r>
-        <w:rPr>
-          <w:b/>
-        </w:rPr>
-        <w:t>Aranck</w:t>
-      </w:r>
-      <w:r>
-        <w:rPr>
-          <w:b w:val="0"/>
-        </w:rPr>
-        <w:t>: the interface, testing, safety, and results (Part 4)</w:t>
+        <w:pStyle w:val="Heading2"/>
+      </w:pPr>
+      <w:r>
+        <w:t>The change journal (the tamper-proof logbook)</w:t>
       </w:r>
     </w:p>
     <w:p>
@@ -129,95 +369,19 @@
         <w:rPr>
           <w:b w:val="0"/>
         </w:rPr>
-        <w:t>Suggested order: Vivek sets up the problem and the architecture, Kshitij and Moksh explain the two halves of the analysis, and Aranck shows it running and reports what it found. The live demo at the end is driven by one person while the others answer questions.</w:t>
-      </w:r>
-    </w:p>
-    <w:p>
-      <w:pPr>
-        <w:pStyle w:val="Heading1"/>
-      </w:pPr>
-      <w:r>
-        <w:t>The one-line version (anyone can say this)</w:t>
-      </w:r>
-    </w:p>
-    <w:p>
+        <w:t xml:space="preserve">NTFS also keeps a running logbook called the </w:t>
+      </w:r>
+      <w:r>
+        <w:rPr>
+          <w:b/>
+        </w:rPr>
+        <w:t>change journal</w:t>
+      </w:r>
       <w:r>
         <w:rPr>
           <w:b w:val="0"/>
         </w:rPr>
-        <w:t>CTRE reads three kinds of Windows evidence offline, finds files whose timestamps were faked, ties data leaving the machine to files changing on disk, and puts it all on one timeline. It never decrypts traffic.</w:t>
-      </w:r>
-    </w:p>
-    <w:p>
-      <w:pPr>
-        <w:pBdr>
-          <w:bottom w:val="single" w:sz="6" w:space="1" w:color="999999"/>
-        </w:pBdr>
-      </w:pPr>
-    </w:p>
-    <w:p>
-      <w:pPr>
-        <w:pStyle w:val="Heading1"/>
-      </w:pPr>
-      <w:r>
-        <w:t>Part 1. Vivek: the problem and the big picture</w:t>
-      </w:r>
-    </w:p>
-    <w:p>
-      <w:pPr>
-        <w:pStyle w:val="Heading2"/>
-      </w:pPr>
-      <w:r>
-        <w:t>What you are explaining</w:t>
-      </w:r>
-    </w:p>
-    <w:p>
-      <w:r>
-        <w:rPr>
-          <w:b w:val="0"/>
-        </w:rPr>
-        <w:t>Why the project exists, and how the whole system fits together. Point at Figure 1 in the paper (the pipeline diagram) while you talk.</w:t>
-      </w:r>
-    </w:p>
-    <w:p>
-      <w:pPr>
-        <w:pStyle w:val="Heading2"/>
-      </w:pPr>
-      <w:r>
-        <w:t>The points to make</w:t>
-      </w:r>
-    </w:p>
-    <w:p>
-      <w:pPr>
-        <w:pStyle w:val="ListBullet"/>
-      </w:pPr>
-      <w:r>
-        <w:rPr>
-          <w:b w:val="0"/>
-        </w:rPr>
-        <w:t>A Windows break-in leaves traces in several places at once: a file lands on disk, the filesystem logs the change, and data leaves over the network.</w:t>
-      </w:r>
-    </w:p>
-    <w:p>
-      <w:pPr>
-        <w:pStyle w:val="ListBullet"/>
-      </w:pPr>
-      <w:r>
-        <w:rPr>
-          <w:b w:val="0"/>
-        </w:rPr>
-        <w:t>These traces are normally looked at with separate tools, so the link between them gets lost. A file appearing and a transfer leaving a few seconds later are only suspicious together.</w:t>
-      </w:r>
-    </w:p>
-    <w:p>
-      <w:pPr>
-        <w:pStyle w:val="ListBullet"/>
-      </w:pPr>
-      <w:r>
-        <w:rPr>
-          <w:b w:val="0"/>
-        </w:rPr>
-        <w:t xml:space="preserve">CTRE takes three artifacts (the </w:t>
+        <w:t xml:space="preserve"> (</w:t>
       </w:r>
       <w:r>
         <w:rPr>
@@ -226,35 +390,41 @@
           <w:color w:val="1A534A"/>
           <w:sz w:val="20"/>
         </w:rPr>
-        <w:t>$MFT</w:t>
+        <w:t>$UsnJrnl</w:t>
       </w:r>
       <w:r>
         <w:rPr>
           <w:b w:val="0"/>
         </w:rPr>
-        <w:t>, the change journal, and a packet capture), reads them together, and answers two questions: were any file timestamps faked, and did data leave the machine right after a file changed?</w:t>
+        <w:t>). Every time a file is created, renamed, written to, or deleted, the system appends a line to this logbook with the time and what happened. It is append-only, so it is a second, independent record of when things really happened. If a file's "easy" clock says it was created in 2019 but the logbook only first mentions the file last week, the 2019 date is a lie.</w:t>
       </w:r>
     </w:p>
     <w:p>
       <w:pPr>
-        <w:pStyle w:val="ListBullet"/>
-      </w:pPr>
-      <w:r>
-        <w:rPr>
-          <w:b w:val="0"/>
-        </w:rPr>
-        <w:t>Everything is offline and read-only. The tool opens copies of already-collected evidence and never writes to them.</w:t>
+        <w:pStyle w:val="Heading2"/>
+      </w:pPr>
+      <w:r>
+        <w:t>What is a packet capture (pcap)?</w:t>
       </w:r>
     </w:p>
     <w:p>
-      <w:pPr>
-        <w:pStyle w:val="ListBullet"/>
-      </w:pPr>
       <w:r>
         <w:rPr>
           <w:b w:val="0"/>
         </w:rPr>
-        <w:t>One deliberate choice: CTRE does not decrypt network traffic. It uses only what is already visible in a capture, such as who was contacted, when, and how much data moved.</w:t>
+        <w:t xml:space="preserve">When computers talk over a network, they send small chunks of data called packets. A </w:t>
+      </w:r>
+      <w:r>
+        <w:rPr>
+          <w:b/>
+        </w:rPr>
+        <w:t>packet capture</w:t>
+      </w:r>
+      <w:r>
+        <w:rPr>
+          <w:b w:val="0"/>
+        </w:rPr>
+        <w:t xml:space="preserve"> (a ".pcap" file) is a saved recording of those packets. From it you can see which machines talked, on which network ports, how much data moved, and when. Tools like Wireshark open these files; our project reads them directly.</w:t>
       </w:r>
     </w:p>
     <w:p>
@@ -262,7 +432,7 @@
         <w:pStyle w:val="Heading2"/>
       </w:pPr>
       <w:r>
-        <w:t>Short script</w:t>
+        <w:t>Encryption, and why we do NOT break it</w:t>
       </w:r>
     </w:p>
     <w:p>
@@ -270,7 +440,31 @@
         <w:rPr>
           <w:b w:val="0"/>
         </w:rPr>
-        <w:t>"When a machine is compromised, the evidence is scattered. The file system knows a new file appeared, the change journal knows exactly when, and the network capture knows that something was sent out. Each tool sees one piece. Our project reads all three together. The pipeline is on this diagram: the three artifacts on the left go through read-only parsers, then into two analysis stages, one for faked timestamps and one for data exfiltration, and the results come out as a single timeline and a report."</w:t>
+        <w:t xml:space="preserve">Most web traffic today is </w:t>
+      </w:r>
+      <w:r>
+        <w:rPr>
+          <w:b/>
+        </w:rPr>
+        <w:t>encrypted</w:t>
+      </w:r>
+      <w:r>
+        <w:rPr>
+          <w:b w:val="0"/>
+        </w:rPr>
+        <w:t xml:space="preserve">: scrambled so that only the two ends can read it. A packet capture of encrypted traffic shows you the envelope but not the letter inside: you can see that machine A sent 2 megabytes to machine B at 3pm, but not what those 2 megabytes contained. CTRE deliberately does </w:t>
+      </w:r>
+      <w:r>
+        <w:rPr>
+          <w:b/>
+        </w:rPr>
+        <w:t>not</w:t>
+      </w:r>
+      <w:r>
+        <w:rPr>
+          <w:b w:val="0"/>
+        </w:rPr>
+        <w:t xml:space="preserve"> try to unscramble (decrypt) this. A tool that reads the secret keys out of a computer's memory and unscrambles traffic is a general-purpose eavesdropping tool, and that is not what we built. The good news is that for catching data theft, the envelope is often enough: a big upload to an unfamiliar machine at a suspicious time is a strong signal on its own.</w:t>
       </w:r>
     </w:p>
     <w:p>
@@ -278,29 +472,116 @@
         <w:pStyle w:val="Heading2"/>
       </w:pPr>
       <w:r>
-        <w:t>If asked</w:t>
+        <w:t>Timestomping (the first thing we detect)</w:t>
       </w:r>
     </w:p>
     <w:p>
-      <w:pPr>
-        <w:pStyle w:val="ListBullet"/>
-      </w:pPr>
       <w:r>
         <w:rPr>
           <w:b w:val="0"/>
         </w:rPr>
-        <w:t>*Why offline?* Because incident response works on copies of collected evidence, not on the live machine. It also means the tool can run on an isolated analysis box with no risk to the original.</w:t>
+        <w:t>"Timestomping" is an anti-forensic trick. An attacker drops a malicious file on a machine and then rewrites its timestamps so it looks old, like it has been a normal part of Windows for years. It is called timestomping because the attacker stomps on the real timestamps. We catch it using the two-clocks idea and the logbook above.</w:t>
       </w:r>
     </w:p>
     <w:p>
       <w:pPr>
+        <w:pStyle w:val="Heading2"/>
+      </w:pPr>
+      <w:r>
+        <w:t>Exfiltration (the second thing we detect)</w:t>
+      </w:r>
+    </w:p>
+    <w:p>
+      <w:r>
+        <w:rPr>
+          <w:b w:val="0"/>
+        </w:rPr>
+        <w:t>"Exfiltration" just means stealing data by sending it off the machine. The classic pattern is: collect or create a file, then upload it somewhere. On a timeline that looks like a file appearing or changing on disk, followed shortly by a large transfer leaving the machine. CTRE looks for exactly that pairing.</w:t>
+      </w:r>
+    </w:p>
+    <w:p>
+      <w:pPr>
+        <w:pStyle w:val="Heading2"/>
+      </w:pPr>
+      <w:r>
+        <w:t>"Offline and read-only"</w:t>
+      </w:r>
+    </w:p>
+    <w:p>
+      <w:r>
+        <w:rPr>
+          <w:b w:val="0"/>
+        </w:rPr>
+        <w:t>CTRE never touches the live machine and never changes the evidence. It opens the collected files for reading only. This is both safer (no risk to the original evidence) and more trustworthy (an investigator can show the tool could not have altered anything).</w:t>
+      </w:r>
+    </w:p>
+    <w:p>
+      <w:pPr>
+        <w:pStyle w:val="Heading2"/>
+      </w:pPr>
+      <w:r>
+        <w:t>What CTRE produces</w:t>
+      </w:r>
+    </w:p>
+    <w:p>
+      <w:r>
+        <w:rPr>
+          <w:b w:val="0"/>
+        </w:rPr>
+        <w:t>After reading the three artifacts, CTRE gives you:</w:t>
+      </w:r>
+    </w:p>
+    <w:p>
+      <w:pPr>
         <w:pStyle w:val="ListBullet"/>
       </w:pPr>
       <w:r>
         <w:rPr>
           <w:b w:val="0"/>
         </w:rPr>
-        <w:t>*Why not just use one existing tool?* The point of the project is the link between artifacts, which single-artifact tools do not show.</w:t>
+        <w:t>a list of files whose timestamps look faked, each with a reason,</w:t>
+      </w:r>
+    </w:p>
+    <w:p>
+      <w:pPr>
+        <w:pStyle w:val="ListBullet"/>
+      </w:pPr>
+      <w:r>
+        <w:rPr>
+          <w:b w:val="0"/>
+        </w:rPr>
+        <w:t>a list of transfers that line up with disk changes, and</w:t>
+      </w:r>
+    </w:p>
+    <w:p>
+      <w:pPr>
+        <w:pStyle w:val="ListBullet"/>
+      </w:pPr>
+      <w:r>
+        <w:rPr>
+          <w:b w:val="0"/>
+        </w:rPr>
+        <w:t xml:space="preserve">one </w:t>
+      </w:r>
+      <w:r>
+        <w:rPr>
+          <w:b/>
+        </w:rPr>
+        <w:t>timeline</w:t>
+      </w:r>
+      <w:r>
+        <w:rPr>
+          <w:b w:val="0"/>
+        </w:rPr>
+        <w:t xml:space="preserve"> that merges every disk and network event in time order,</w:t>
+      </w:r>
+    </w:p>
+    <w:p>
+      <w:r>
+        <w:rPr>
+          <w:b w:val="0"/>
+        </w:rPr>
+        <w:t>shown in a web page and downloadable as a report.</w:t>
       </w:r>
     </w:p>
     <w:p>
@@ -315,31 +596,49 @@
         <w:pStyle w:val="Heading1"/>
       </w:pPr>
       <w:r>
-        <w:t>Part 2. Kshitij: disk forensics and timestomping</w:t>
+        <w:t>The project as one picture</w:t>
       </w:r>
     </w:p>
     <w:p>
-      <w:pPr>
-        <w:pStyle w:val="Heading2"/>
-      </w:pPr>
-      <w:r>
-        <w:t>What you are explaining</w:t>
+      <w:r>
+        <w:rPr>
+          <w:b w:val="0"/>
+        </w:rPr>
+        <w:t>Think of CTRE as an assembly line (this is Figure 1 in the paper):</w:t>
       </w:r>
     </w:p>
     <w:p>
+      <w:pPr>
+        <w:pStyle w:val="ListBullet"/>
+      </w:pPr>
       <w:r>
         <w:rPr>
           <w:b w:val="0"/>
         </w:rPr>
-        <w:t>How CTRE reads the two NTFS artifacts and how it catches faked timestamps. Point at Figure 2 (the decision flowchart) for the detection rules.</w:t>
+        <w:t>Three inputs go in on the left: the MFT, the change journal, and the pcap.</w:t>
       </w:r>
     </w:p>
     <w:p>
       <w:pPr>
-        <w:pStyle w:val="Heading2"/>
-      </w:pPr>
-      <w:r>
-        <w:t>Background you may need to give</w:t>
+        <w:pStyle w:val="ListBullet"/>
+      </w:pPr>
+      <w:r>
+        <w:rPr>
+          <w:b w:val="0"/>
+        </w:rPr>
+        <w:t xml:space="preserve">Each goes through a </w:t>
+      </w:r>
+      <w:r>
+        <w:rPr>
+          <w:b/>
+        </w:rPr>
+        <w:t>parser</w:t>
+      </w:r>
+      <w:r>
+        <w:rPr>
+          <w:b w:val="0"/>
+        </w:rPr>
+        <w:t>, a piece of code that understands that file's format and pulls out the useful pieces.</w:t>
       </w:r>
     </w:p>
     <w:p>
@@ -350,7 +649,50 @@
         <w:rPr>
           <w:b w:val="0"/>
         </w:rPr>
-        <w:t xml:space="preserve">The </w:t>
+        <w:t xml:space="preserve">The parsed data feeds two </w:t>
+      </w:r>
+      <w:r>
+        <w:rPr>
+          <w:b/>
+        </w:rPr>
+        <w:t>analysis</w:t>
+      </w:r>
+      <w:r>
+        <w:rPr>
+          <w:b w:val="0"/>
+        </w:rPr>
+        <w:t xml:space="preserve"> steps: one looks for faked timestamps, the other looks for exfiltration.</w:t>
+      </w:r>
+    </w:p>
+    <w:p>
+      <w:pPr>
+        <w:pStyle w:val="ListBullet"/>
+      </w:pPr>
+      <w:r>
+        <w:rPr>
+          <w:b w:val="0"/>
+        </w:rPr>
+        <w:t xml:space="preserve">The results come out as one </w:t>
+      </w:r>
+      <w:r>
+        <w:rPr>
+          <w:b/>
+        </w:rPr>
+        <w:t>timeline and report</w:t>
+      </w:r>
+      <w:r>
+        <w:rPr>
+          <w:b w:val="0"/>
+        </w:rPr>
+        <w:t>.</w:t>
+      </w:r>
+    </w:p>
+    <w:p>
+      <w:r>
+        <w:rPr>
+          <w:b w:val="0"/>
+        </w:rPr>
+        <w:t xml:space="preserve">The code mirrors this exactly. Each stage is one file in the </w:t>
       </w:r>
       <w:r>
         <w:rPr>
@@ -359,14 +701,19 @@
           <w:color w:val="1A534A"/>
           <w:sz w:val="20"/>
         </w:rPr>
-        <w:t>$MFT</w:t>
+        <w:t>ctre/</w:t>
       </w:r>
       <w:r>
         <w:rPr>
           <w:b w:val="0"/>
         </w:rPr>
-        <w:t xml:space="preserve"> (master file table) has one record per file. Each record stores timestamps in two places: </w:t>
-      </w:r>
+        <w:t xml:space="preserve"> folder:</w:t>
+      </w:r>
+    </w:p>
+    <w:p>
+      <w:pPr>
+        <w:pStyle w:val="ListBullet"/>
+      </w:pPr>
       <w:r>
         <w:rPr>
           <w:rFonts w:ascii="Consolas" w:hAnsi="Consolas"/>
@@ -374,13 +721,13 @@
           <w:color w:val="1A534A"/>
           <w:sz w:val="20"/>
         </w:rPr>
-        <w:t>$STANDARD_INFORMATION</w:t>
+        <w:t>ctre/mft.py</w:t>
       </w:r>
       <w:r>
         <w:rPr>
           <w:b w:val="0"/>
         </w:rPr>
-        <w:t xml:space="preserve"> (SI), which is what tools and users see and is easy to rewrite, and </w:t>
+        <w:t xml:space="preserve"> and </w:t>
       </w:r>
       <w:r>
         <w:rPr>
@@ -389,25 +736,19 @@
           <w:color w:val="1A534A"/>
           <w:sz w:val="20"/>
         </w:rPr>
-        <w:t>$FILE_NAME</w:t>
+        <w:t>ctre/usnjrnl.py</w:t>
       </w:r>
       <w:r>
         <w:rPr>
           <w:b w:val="0"/>
         </w:rPr>
-        <w:t xml:space="preserve"> (FN), which the kernel maintains and is harder to forge.</w:t>
+        <w:t>: the disk parsers.</w:t>
       </w:r>
     </w:p>
     <w:p>
       <w:pPr>
         <w:pStyle w:val="ListBullet"/>
       </w:pPr>
-      <w:r>
-        <w:rPr>
-          <w:b w:val="0"/>
-        </w:rPr>
-        <w:t xml:space="preserve">The </w:t>
-      </w:r>
       <w:r>
         <w:rPr>
           <w:rFonts w:ascii="Consolas" w:hAnsi="Consolas"/>
@@ -415,44 +756,19 @@
           <w:color w:val="1A534A"/>
           <w:sz w:val="20"/>
         </w:rPr>
-        <w:t>$UsnJrnl</w:t>
+        <w:t>ctre/pcap_meta.py</w:t>
       </w:r>
       <w:r>
         <w:rPr>
           <w:b w:val="0"/>
         </w:rPr>
-        <w:t xml:space="preserve"> is the change journal: an append-only log the kernel keeps of every filesystem change, with the time and the kind of change.</w:t>
+        <w:t>: the network parser.</w:t>
       </w:r>
     </w:p>
     <w:p>
       <w:pPr>
         <w:pStyle w:val="ListBullet"/>
       </w:pPr>
-      <w:r>
-        <w:rPr>
-          <w:b w:val="0"/>
-        </w:rPr>
-        <w:t>Timestomping is an anti-forensic trick: an attacker rewrites a malicious file's timestamps so it looks old and blends in with system files.</w:t>
-      </w:r>
-    </w:p>
-    <w:p>
-      <w:pPr>
-        <w:pStyle w:val="Heading2"/>
-      </w:pPr>
-      <w:r>
-        <w:t>The points to make</w:t>
-      </w:r>
-    </w:p>
-    <w:p>
-      <w:pPr>
-        <w:pStyle w:val="ListBullet"/>
-      </w:pPr>
-      <w:r>
-        <w:rPr>
-          <w:b w:val="0"/>
-        </w:rPr>
-        <w:t xml:space="preserve">The parser reads each </w:t>
-      </w:r>
       <w:r>
         <w:rPr>
           <w:rFonts w:ascii="Consolas" w:hAnsi="Consolas"/>
@@ -460,36 +776,19 @@
           <w:color w:val="1A534A"/>
           <w:sz w:val="20"/>
         </w:rPr>
-        <w:t>$MFT</w:t>
+        <w:t>ctre/timestomp.py</w:t>
       </w:r>
       <w:r>
         <w:rPr>
           <w:b w:val="0"/>
         </w:rPr>
-        <w:t xml:space="preserve"> record, applies the NTFS fixups (a check NTFS uses to catch torn writes), and pulls out both timestamp sets.</w:t>
+        <w:t>: the timestamp-tampering detector.</w:t>
       </w:r>
     </w:p>
     <w:p>
       <w:pPr>
         <w:pStyle w:val="ListBullet"/>
       </w:pPr>
-      <w:r>
-        <w:rPr>
-          <w:b w:val="0"/>
-        </w:rPr>
-        <w:t>The journal parser handles real-world size: an extracted journal can be several gigabytes of mostly empty space, so it memory-maps the file and skips the empty regions instead of loading it all. A one-gigabyte sparse test file parses in about 4.5 seconds.</w:t>
-      </w:r>
-    </w:p>
-    <w:p>
-      <w:pPr>
-        <w:pStyle w:val="ListBullet"/>
-      </w:pPr>
-      <w:r>
-        <w:rPr>
-          <w:b w:val="0"/>
-        </w:rPr>
-        <w:t xml:space="preserve">Detection works by disagreement. The four rules are: - </w:t>
-      </w:r>
       <w:r>
         <w:rPr>
           <w:rFonts w:ascii="Consolas" w:hAnsi="Consolas"/>
@@ -497,14 +796,19 @@
           <w:color w:val="1A534A"/>
           <w:sz w:val="20"/>
         </w:rPr>
-        <w:t>SI_BEFORE_FN</w:t>
+        <w:t>ctre/correlate.py</w:t>
       </w:r>
       <w:r>
         <w:rPr>
           <w:b w:val="0"/>
         </w:rPr>
-        <w:t xml:space="preserve"> (high): the file's SI creation time is earlier than its FN creation time. A file cannot exist before its own name record. - </w:t>
-      </w:r>
+        <w:t>: the exfiltration matcher and the timeline builder.</w:t>
+      </w:r>
+    </w:p>
+    <w:p>
+      <w:pPr>
+        <w:pStyle w:val="ListBullet"/>
+      </w:pPr>
       <w:r>
         <w:rPr>
           <w:rFonts w:ascii="Consolas" w:hAnsi="Consolas"/>
@@ -512,14 +816,19 @@
           <w:color w:val="1A534A"/>
           <w:sz w:val="20"/>
         </w:rPr>
-        <w:t>SI_BEFORE_JRNL</w:t>
+        <w:t>ctre/report.py</w:t>
       </w:r>
       <w:r>
         <w:rPr>
           <w:b w:val="0"/>
         </w:rPr>
-        <w:t xml:space="preserve"> (high): the SI creation time is earlier than the journal's record of the file being created. - </w:t>
-      </w:r>
+        <w:t>: the report writer.</w:t>
+      </w:r>
+    </w:p>
+    <w:p>
+      <w:pPr>
+        <w:pStyle w:val="ListBullet"/>
+      </w:pPr>
       <w:r>
         <w:rPr>
           <w:rFonts w:ascii="Consolas" w:hAnsi="Consolas"/>
@@ -527,14 +836,19 @@
           <w:color w:val="1A534A"/>
           <w:sz w:val="20"/>
         </w:rPr>
-        <w:t>ZERO_SUBSECOND</w:t>
+        <w:t>ctre/service.py</w:t>
       </w:r>
       <w:r>
         <w:rPr>
           <w:b w:val="0"/>
         </w:rPr>
-        <w:t xml:space="preserve"> (medium): several SI timestamps have their sub-second digits zeroed, which many timestomping tools produce. - </w:t>
-      </w:r>
+        <w:t>: the manager that runs all the stages in order.</w:t>
+      </w:r>
+    </w:p>
+    <w:p>
+      <w:pPr>
+        <w:pStyle w:val="ListBullet"/>
+      </w:pPr>
       <w:r>
         <w:rPr>
           <w:rFonts w:ascii="Consolas" w:hAnsi="Consolas"/>
@@ -542,51 +856,13 @@
           <w:color w:val="1A534A"/>
           <w:sz w:val="20"/>
         </w:rPr>
-        <w:t>NO_JRNL_FOR_CHANGE</w:t>
+        <w:t>ctre/web.py</w:t>
       </w:r>
       <w:r>
         <w:rPr>
           <w:b w:val="0"/>
         </w:rPr>
-        <w:t xml:space="preserve"> (medium): the SI modified time is newer than any journal entry for the file.</w:t>
-      </w:r>
-    </w:p>
-    <w:p>
-      <w:pPr>
-        <w:pStyle w:val="ListBullet"/>
-      </w:pPr>
-      <w:r>
-        <w:rPr>
-          <w:b w:val="0"/>
-        </w:rPr>
-        <w:t>Each finding comes with a severity and a written reason, so it reads as an explanation, not just a flag.</w:t>
-      </w:r>
-    </w:p>
-    <w:p>
-      <w:pPr>
-        <w:pStyle w:val="Heading2"/>
-      </w:pPr>
-      <w:r>
-        <w:t>The part worth emphasizing (the false-positive guards)</w:t>
-      </w:r>
-    </w:p>
-    <w:p>
-      <w:r>
-        <w:rPr>
-          <w:b w:val="0"/>
-        </w:rPr>
-        <w:t>Two of these rules would misfire on real disks without care, and we fixed that:</w:t>
-      </w:r>
-    </w:p>
-    <w:p>
-      <w:pPr>
-        <w:pStyle w:val="ListBullet"/>
-      </w:pPr>
-      <w:r>
-        <w:rPr>
-          <w:b w:val="0"/>
-        </w:rPr>
-        <w:t xml:space="preserve">The journal is a ring buffer, so its oldest surviving record is usually not the file's creation. The </w:t>
+        <w:t xml:space="preserve"> and </w:t>
       </w:r>
       <w:r>
         <w:rPr>
@@ -595,24 +871,165 @@
           <w:color w:val="1A534A"/>
           <w:sz w:val="20"/>
         </w:rPr>
-        <w:t>SI_BEFORE_JRNL</w:t>
+        <w:t>ctre/web/</w:t>
       </w:r>
       <w:r>
         <w:rPr>
           <w:b w:val="0"/>
         </w:rPr>
-        <w:t xml:space="preserve"> rule only fires when the journal actually holds a creation record, not just an old edit.</w:t>
+        <w:t>: the web app.</w:t>
       </w:r>
     </w:p>
     <w:p>
-      <w:pPr>
-        <w:pStyle w:val="ListBullet"/>
-      </w:pPr>
       <w:r>
         <w:rPr>
           <w:b w:val="0"/>
         </w:rPr>
-        <w:t xml:space="preserve">Windows reuses an </w:t>
+        <w:t>Keep this map in mind: each presenter owns a few of these files.</w:t>
+      </w:r>
+    </w:p>
+    <w:p>
+      <w:pPr>
+        <w:pBdr>
+          <w:bottom w:val="single" w:sz="6" w:space="1" w:color="999999"/>
+        </w:pBdr>
+      </w:pPr>
+    </w:p>
+    <w:p>
+      <w:pPr>
+        <w:pStyle w:val="Heading1"/>
+      </w:pPr>
+      <w:r>
+        <w:t>Part 1 - Vivek: the problem and the big picture</w:t>
+      </w:r>
+    </w:p>
+    <w:p>
+      <w:pPr>
+        <w:pStyle w:val="Heading2"/>
+      </w:pPr>
+      <w:r>
+        <w:t>The idea in plain words</w:t>
+      </w:r>
+    </w:p>
+    <w:p>
+      <w:r>
+        <w:rPr>
+          <w:b w:val="0"/>
+        </w:rPr>
+        <w:t>Vivek's job is to make the audience care about the problem before anyone talks about code. The problem is that the evidence from an attack is scattered across different places, and the clue that solves the case is often the *relationship* between two pieces, not either piece alone.</w:t>
+      </w:r>
+    </w:p>
+    <w:p>
+      <w:pPr>
+        <w:pStyle w:val="Heading2"/>
+      </w:pPr>
+      <w:r>
+        <w:t>Why it matters to the project</w:t>
+      </w:r>
+    </w:p>
+    <w:p>
+      <w:r>
+        <w:rPr>
+          <w:b w:val="0"/>
+        </w:rPr>
+        <w:t>Everything else in the project exists to join those scattered pieces. If the audience understands this, Kshitij's and Moksh's parts land as "here is how we join piece A and piece B," instead of as disconnected technical details.</w:t>
+      </w:r>
+    </w:p>
+    <w:p>
+      <w:pPr>
+        <w:pStyle w:val="Heading2"/>
+      </w:pPr>
+      <w:r>
+        <w:t>What to explain, step by step</w:t>
+      </w:r>
+    </w:p>
+    <w:p>
+      <w:pPr>
+        <w:pStyle w:val="ListNumber"/>
+      </w:pPr>
+      <w:r>
+        <w:rPr>
+          <w:b/>
+        </w:rPr>
+        <w:t>The scatter problem.</w:t>
+      </w:r>
+      <w:r>
+        <w:rPr>
+          <w:b w:val="0"/>
+        </w:rPr>
+        <w:t xml:space="preserve"> A file lands on disk (the file system knows), the</w:t>
+      </w:r>
+    </w:p>
+    <w:p>
+      <w:r>
+        <w:rPr>
+          <w:b w:val="0"/>
+        </w:rPr>
+        <w:t xml:space="preserve">system logs the change (the journal knows), and data leaves (the capture knows). Three witnesses, three separate notebooks. 2. </w:t>
+      </w:r>
+      <w:r>
+        <w:rPr>
+          <w:b/>
+        </w:rPr>
+        <w:t>Why that is hard today.</w:t>
+      </w:r>
+      <w:r>
+        <w:rPr>
+          <w:b w:val="0"/>
+        </w:rPr>
+        <w:t xml:space="preserve"> Investigators use a different tool for each notebook and reconcile them by hand. Links get missed, especially timing links like "this file was created ten seconds before this upload." 3. </w:t>
+      </w:r>
+      <w:r>
+        <w:rPr>
+          <w:b/>
+        </w:rPr>
+        <w:t>What CTRE does about it.</w:t>
+      </w:r>
+      <w:r>
+        <w:rPr>
+          <w:b w:val="0"/>
+        </w:rPr>
+        <w:t xml:space="preserve"> It reads all three notebooks at once and answers two questions automatically: were any timestamps faked, and did data leave right after a file changed? 4. </w:t>
+      </w:r>
+      <w:r>
+        <w:rPr>
+          <w:b/>
+        </w:rPr>
+        <w:t>The two ground rules.</w:t>
+      </w:r>
+      <w:r>
+        <w:rPr>
+          <w:b w:val="0"/>
+        </w:rPr>
+        <w:t xml:space="preserve"> Everything is offline and read-only (we study copies, we never change evidence), and we never decrypt traffic (we use only what is already visible, which is enough for the theft question). 5. </w:t>
+      </w:r>
+      <w:r>
+        <w:rPr>
+          <w:b/>
+        </w:rPr>
+        <w:t>The assembly line.</w:t>
+      </w:r>
+      <w:r>
+        <w:rPr>
+          <w:b w:val="0"/>
+        </w:rPr>
+        <w:t xml:space="preserve"> Walk through Figure 1 slowly: three inputs, parsers, two analysers, one timeline out.</w:t>
+      </w:r>
+    </w:p>
+    <w:p>
+      <w:pPr>
+        <w:pStyle w:val="Heading2"/>
+      </w:pPr>
+      <w:r>
+        <w:t>Where this lives in the project</w:t>
+      </w:r>
+    </w:p>
+    <w:p>
+      <w:r>
+        <w:rPr>
+          <w:b w:val="0"/>
+        </w:rPr>
+        <w:t xml:space="preserve">Vivek is explaining the shape of the whole system, so the relevant file is </w:t>
       </w:r>
       <w:r>
         <w:rPr>
@@ -621,314 +1038,13 @@
           <w:color w:val="1A534A"/>
           <w:sz w:val="20"/>
         </w:rPr>
-        <w:t>$MFT</w:t>
+        <w:t>ctre/service.py</w:t>
       </w:r>
       <w:r>
         <w:rPr>
           <w:b w:val="0"/>
         </w:rPr>
-        <w:t xml:space="preserve"> record number after a file is deleted, so journal history from a deleted file can attach to the file that replaced it. The detector also matches on the record's sequence number, which tells the two apart.</w:t>
-      </w:r>
-    </w:p>
-    <w:p>
-      <w:r>
-        <w:rPr>
-          <w:b w:val="0"/>
-        </w:rPr>
-        <w:t>Both of these have their own regression tests.</w:t>
-      </w:r>
-    </w:p>
-    <w:p>
-      <w:pPr>
-        <w:pStyle w:val="Heading2"/>
-      </w:pPr>
-      <w:r>
-        <w:t>Short script</w:t>
-      </w:r>
-    </w:p>
-    <w:p>
-      <w:r>
-        <w:rPr>
-          <w:b w:val="0"/>
-        </w:rPr>
-        <w:t>"Windows keeps two sets of timestamps. One is easy to fake, one is not. Our detector plays them against each other and against the change journal. If the easy-to-fake time says a file was created in 2019 but the journal says the file was actually created last week, that gap is the tampering. This flowchart is the exact set of checks, and each one produces a severity and a plain-English reason."</w:t>
-      </w:r>
-    </w:p>
-    <w:p>
-      <w:pPr>
-        <w:pStyle w:val="Heading2"/>
-      </w:pPr>
-      <w:r>
-        <w:t>If asked</w:t>
-      </w:r>
-    </w:p>
-    <w:p>
-      <w:pPr>
-        <w:pStyle w:val="ListBullet"/>
-      </w:pPr>
-      <w:r>
-        <w:rPr>
-          <w:b w:val="0"/>
-        </w:rPr>
-        <w:t>*Can this false-positive?* The sub-second rule can: files from ZIP archives or FAT media also have zeroed sub-seconds, so we treat that as a medium-level lead, not proof. The two high-severity rules have guards for journal wrap and record reuse.</w:t>
-      </w:r>
-    </w:p>
-    <w:p>
-      <w:pPr>
-        <w:pStyle w:val="ListBullet"/>
-      </w:pPr>
-      <w:r>
-        <w:rPr>
-          <w:b w:val="0"/>
-        </w:rPr>
-        <w:t>*What if the journal is huge?* It is memory-mapped and the empty space is skipped, so size is not a problem.</w:t>
-      </w:r>
-    </w:p>
-    <w:p>
-      <w:pPr>
-        <w:pBdr>
-          <w:bottom w:val="single" w:sz="6" w:space="1" w:color="999999"/>
-        </w:pBdr>
-      </w:pPr>
-    </w:p>
-    <w:p>
-      <w:pPr>
-        <w:pStyle w:val="Heading1"/>
-      </w:pPr>
-      <w:r>
-        <w:t>Part 3. Moksh: network metadata and correlation</w:t>
-      </w:r>
-    </w:p>
-    <w:p>
-      <w:pPr>
-        <w:pStyle w:val="Heading2"/>
-      </w:pPr>
-      <w:r>
-        <w:t>What you are explaining</w:t>
-      </w:r>
-    </w:p>
-    <w:p>
-      <w:r>
-        <w:rPr>
-          <w:b w:val="0"/>
-        </w:rPr>
-        <w:t>How CTRE reads the packet capture without decrypting it, and how it links network activity to disk activity. Point at Figure 3 (the correlation flow).</w:t>
-      </w:r>
-    </w:p>
-    <w:p>
-      <w:pPr>
-        <w:pStyle w:val="Heading2"/>
-      </w:pPr>
-      <w:r>
-        <w:t>The points to make</w:t>
-      </w:r>
-    </w:p>
-    <w:p>
-      <w:pPr>
-        <w:pStyle w:val="ListBullet"/>
-      </w:pPr>
-      <w:r>
-        <w:rPr>
-          <w:b w:val="0"/>
-        </w:rPr>
-        <w:t>The pcap reader parses the classic capture format with Ethernet and IPv4. It builds one flow record per connection: the endpoints, ports, how many packets and bytes went each way, and the first and last time it was seen.</w:t>
-      </w:r>
-    </w:p>
-    <w:p>
-      <w:pPr>
-        <w:pStyle w:val="ListBullet"/>
-      </w:pPr>
-      <w:r>
-        <w:rPr>
-          <w:b w:val="0"/>
-        </w:rPr>
-        <w:t>It also reads two things that are in the clear even on encrypted connections: DNS query names, and the server name a client sends when starting a TLS connection (the SNI).</w:t>
-      </w:r>
-    </w:p>
-    <w:p>
-      <w:pPr>
-        <w:pStyle w:val="ListBullet"/>
-      </w:pPr>
-      <w:r>
-        <w:rPr>
-          <w:b w:val="0"/>
-        </w:rPr>
-        <w:t>It never decrypts anything. For the exfiltration question that is fine, because the signal is the size, timing, and destination of a transfer, not the bytes inside it.</w:t>
-      </w:r>
-    </w:p>
-    <w:p>
-      <w:pPr>
-        <w:pStyle w:val="ListBullet"/>
-      </w:pPr>
-      <w:r>
-        <w:rPr>
-          <w:b w:val="0"/>
-        </w:rPr>
-        <w:t>The correlator looks for a large outbound flow whose start time is within a set window of a disk change in the journal. That pairing is the shape of staging a file and then sending it out.</w:t>
-      </w:r>
-    </w:p>
-    <w:p>
-      <w:pPr>
-        <w:pStyle w:val="ListBullet"/>
-      </w:pPr>
-      <w:r>
-        <w:rPr>
-          <w:b w:val="0"/>
-        </w:rPr>
-        <w:t>Everything, disk events and network events, goes onto one timeline sorted by time, so the sequence of create, log, and send reads top to bottom.</w:t>
-      </w:r>
-    </w:p>
-    <w:p>
-      <w:pPr>
-        <w:pStyle w:val="Heading2"/>
-      </w:pPr>
-      <w:r>
-        <w:t>Why keyless analysis is the right call here</w:t>
-      </w:r>
-    </w:p>
-    <w:p>
-      <w:r>
-        <w:rPr>
-          <w:b w:val="0"/>
-        </w:rPr>
-        <w:t>The original brief included reading encryption keys out of memory and decrypting the traffic. We left that out on purpose: the same code decrypts anyone's traffic, so it is a general-purpose interception tool regardless of how it is packaged. The exfiltration signal does not need it. This is a good point to make because it shows a deliberate security and ethics decision, not a gap.</w:t>
-      </w:r>
-    </w:p>
-    <w:p>
-      <w:pPr>
-        <w:pStyle w:val="Heading2"/>
-      </w:pPr>
-      <w:r>
-        <w:t>Short script</w:t>
-      </w:r>
-    </w:p>
-    <w:p>
-      <w:r>
-        <w:rPr>
-          <w:b w:val="0"/>
-        </w:rPr>
-        <w:t>"We do not break encryption. We do not need to. A capture still tells us who was contacted, when, and how much left the machine, plus the hostname in the DNS query and the TLS handshake. Our correlator takes every large outbound transfer and checks whether a file changed on disk right around the same time. When those two line up, that is the pattern of data being staged and exfiltrated, and it goes on the timeline next to the disk events."</w:t>
-      </w:r>
-    </w:p>
-    <w:p>
-      <w:pPr>
-        <w:pStyle w:val="Heading2"/>
-      </w:pPr>
-      <w:r>
-        <w:t>If asked</w:t>
-      </w:r>
-    </w:p>
-    <w:p>
-      <w:pPr>
-        <w:pStyle w:val="ListBullet"/>
-      </w:pPr>
-      <w:r>
-        <w:rPr>
-          <w:b w:val="0"/>
-        </w:rPr>
-        <w:t>*How do you know a flow is outbound and large?* We compare byte counts per direction and apply a size threshold, which is adjustable in the UI.</w:t>
-      </w:r>
-    </w:p>
-    <w:p>
-      <w:pPr>
-        <w:pStyle w:val="ListBullet"/>
-      </w:pPr>
-      <w:r>
-        <w:rPr>
-          <w:b w:val="0"/>
-        </w:rPr>
-        <w:t>*Could this miss slow exfiltration?* Yes, a transfer spread thinly over a long time can stay under the threshold and window; that is a known limitation.</w:t>
-      </w:r>
-    </w:p>
-    <w:p>
-      <w:pPr>
-        <w:pBdr>
-          <w:bottom w:val="single" w:sz="6" w:space="1" w:color="999999"/>
-        </w:pBdr>
-      </w:pPr>
-    </w:p>
-    <w:p>
-      <w:pPr>
-        <w:pStyle w:val="Heading1"/>
-      </w:pPr>
-      <w:r>
-        <w:t>Part 4. Aranck: interface, testing, safety, and results</w:t>
-      </w:r>
-    </w:p>
-    <w:p>
-      <w:pPr>
-        <w:pStyle w:val="Heading2"/>
-      </w:pPr>
-      <w:r>
-        <w:t>What you are explaining</w:t>
-      </w:r>
-    </w:p>
-    <w:p>
-      <w:r>
-        <w:rPr>
-          <w:b w:val="0"/>
-        </w:rPr>
-        <w:t>How someone actually uses the tool, how we know it works, the safety of the local server, and what it found on the test case.</w:t>
-      </w:r>
-    </w:p>
-    <w:p>
-      <w:pPr>
-        <w:pStyle w:val="Heading2"/>
-      </w:pPr>
-      <w:r>
-        <w:t>The points to make (interface)</w:t>
-      </w:r>
-    </w:p>
-    <w:p>
-      <w:pPr>
-        <w:pStyle w:val="ListBullet"/>
-      </w:pPr>
-      <w:r>
-        <w:rPr>
-          <w:b w:val="0"/>
-        </w:rPr>
-        <w:t>Two ways to run it: a command line, and a local web page that opens in the browser when you run the tool with no arguments.</w:t>
-      </w:r>
-    </w:p>
-    <w:p>
-      <w:pPr>
-        <w:pStyle w:val="ListBullet"/>
-      </w:pPr>
-      <w:r>
-        <w:rPr>
-          <w:b w:val="0"/>
-        </w:rPr>
-        <w:t>The web page explains the project as you go: an overview with the pipeline diagram, numbered steps, a built-in sample case, and a reference section with the rules and a glossary. After a run it prints a plain summary of what it found.</w:t>
-      </w:r>
-    </w:p>
-    <w:p>
-      <w:pPr>
-        <w:pStyle w:val="Heading2"/>
-      </w:pPr>
-      <w:r>
-        <w:t>The points to make (safety of the local server)</w:t>
-      </w:r>
-    </w:p>
-    <w:p>
-      <w:pPr>
-        <w:pStyle w:val="ListBullet"/>
-      </w:pPr>
-      <w:r>
-        <w:rPr>
-          <w:b w:val="0"/>
-        </w:rPr>
-        <w:t>The server listens only on the local machine (the loopback address).</w:t>
-      </w:r>
-    </w:p>
-    <w:p>
-      <w:pPr>
-        <w:pStyle w:val="ListBullet"/>
-      </w:pPr>
-      <w:r>
-        <w:rPr>
-          <w:b w:val="0"/>
-        </w:rPr>
-        <w:t xml:space="preserve">It checks the </w:t>
+        <w:t xml:space="preserve">, the manager that runs the stages in order (its </w:t>
       </w:r>
       <w:r>
         <w:rPr>
@@ -937,117 +1053,13 @@
           <w:color w:val="1A534A"/>
           <w:sz w:val="20"/>
         </w:rPr>
-        <w:t>Host</w:t>
+        <w:t>run_analysis</w:t>
       </w:r>
       <w:r>
         <w:rPr>
           <w:b w:val="0"/>
         </w:rPr>
-        <w:t xml:space="preserve"> header, so a different site cannot reach it by name.</w:t>
-      </w:r>
-    </w:p>
-    <w:p>
-      <w:pPr>
-        <w:pStyle w:val="ListBullet"/>
-      </w:pPr>
-      <w:r>
-        <w:rPr>
-          <w:b w:val="0"/>
-        </w:rPr>
-        <w:t>It requires a custom header on every API call, which stops other websites open in the browser from driving it.</w:t>
-      </w:r>
-    </w:p>
-    <w:p>
-      <w:pPr>
-        <w:pStyle w:val="ListBullet"/>
-      </w:pPr>
-      <w:r>
-        <w:rPr>
-          <w:b w:val="0"/>
-        </w:rPr>
-        <w:t>It sends a strict Content-Security-Policy, and it deletes uploaded files when it stops.</w:t>
-      </w:r>
-    </w:p>
-    <w:p>
-      <w:pPr>
-        <w:pStyle w:val="ListBullet"/>
-      </w:pPr>
-      <w:r>
-        <w:rPr>
-          <w:b w:val="0"/>
-        </w:rPr>
-        <w:t>All evidence text is put on the page as plain text, so a hostile file name cannot inject code into the page or the report.</w:t>
-      </w:r>
-    </w:p>
-    <w:p>
-      <w:pPr>
-        <w:pStyle w:val="Heading2"/>
-      </w:pPr>
-      <w:r>
-        <w:t>The points to make (testing)</w:t>
-      </w:r>
-    </w:p>
-    <w:p>
-      <w:pPr>
-        <w:pStyle w:val="ListBullet"/>
-      </w:pPr>
-      <w:r>
-        <w:rPr>
-          <w:b w:val="0"/>
-        </w:rPr>
-        <w:t>There is a generator that writes fake artifacts in the exact on-disk formats the parsers read, so the generator and the parsers check each other.</w:t>
-      </w:r>
-    </w:p>
-    <w:p>
-      <w:pPr>
-        <w:pStyle w:val="ListBullet"/>
-      </w:pPr>
-      <w:r>
-        <w:rPr>
-          <w:b w:val="0"/>
-        </w:rPr>
-        <w:t>It plants one timestomped file and one timed transfer, so there is a known right answer.</w:t>
-      </w:r>
-    </w:p>
-    <w:p>
-      <w:pPr>
-        <w:pStyle w:val="ListBullet"/>
-      </w:pPr>
-      <w:r>
-        <w:rPr>
-          <w:b w:val="0"/>
-        </w:rPr>
-        <w:t>There are 20 tests covering the timestamp math, each parser, the four rules, the correlation, the report escaping, and a full upload-run-download cycle against the live server. All pass.</w:t>
-      </w:r>
-    </w:p>
-    <w:p>
-      <w:pPr>
-        <w:pStyle w:val="ListBullet"/>
-      </w:pPr>
-      <w:r>
-        <w:rPr>
-          <w:b w:val="0"/>
-        </w:rPr>
-        <w:t>The pcap reader was cross-checked against scapy, a separate packet library, and the packet count, DNS name, TLS server name, and byte totals matched.</w:t>
-      </w:r>
-    </w:p>
-    <w:p>
-      <w:pPr>
-        <w:pStyle w:val="Heading2"/>
-      </w:pPr>
-      <w:r>
-        <w:t>The points to make (results on the sample)</w:t>
-      </w:r>
-    </w:p>
-    <w:p>
-      <w:pPr>
-        <w:pStyle w:val="ListBullet"/>
-      </w:pPr>
-      <w:r>
-        <w:rPr>
-          <w:b w:val="0"/>
-        </w:rPr>
-        <w:t xml:space="preserve">Parsed 2 </w:t>
+        <w:t xml:space="preserve"> function calls each parser, then each analyser, then assembles the results). You do not need to read code to the audience; just say "one coordinator runs each stage in turn, and that is </w:t>
       </w:r>
       <w:r>
         <w:rPr>
@@ -1056,24 +1068,254 @@
           <w:color w:val="1A534A"/>
           <w:sz w:val="20"/>
         </w:rPr>
-        <w:t>$MFT</w:t>
+        <w:t>service.py</w:t>
       </w:r>
       <w:r>
         <w:rPr>
           <w:b w:val="0"/>
         </w:rPr>
-        <w:t xml:space="preserve"> entries, 4 journal records, 122 packets in 2 flows.</w:t>
+        <w:t>."</w:t>
       </w:r>
     </w:p>
     <w:p>
       <w:pPr>
+        <w:pStyle w:val="Heading2"/>
+      </w:pPr>
+      <w:r>
+        <w:t>Script</w:t>
+      </w:r>
+    </w:p>
+    <w:p>
+      <w:r>
+        <w:rPr>
+          <w:b w:val="0"/>
+        </w:rPr>
+        <w:t>"When a machine gets attacked, the evidence is scattered. The file system knows a new file appeared. The file system's own logbook knows exactly when. And the network recording knows that data was sent out. The catch is that each of these is normally read with a different tool, so the connection between them, like a file being created right before a big upload, is easy to miss. Our project reads all three together. On this diagram you can see the whole flow: the three pieces of evidence on the left go through parsers that understand their formats, then into two analysis steps, one for faked timestamps and one for data being stolen, and everything comes out as a single timeline. Two rules we never break: we only ever read copies of the evidence, and we never decrypt anyone's traffic."</w:t>
+      </w:r>
+    </w:p>
+    <w:p>
+      <w:pPr>
+        <w:pStyle w:val="Heading2"/>
+      </w:pPr>
+      <w:r>
+        <w:t>Analogy</w:t>
+      </w:r>
+    </w:p>
+    <w:p>
+      <w:r>
+        <w:rPr>
+          <w:b w:val="0"/>
+        </w:rPr>
+        <w:t>Three security cameras recorded the same break-in from different angles, but each tape is in a different room and on a different machine. CTRE is the editing desk that lines all three up on one screen with a shared clock.</w:t>
+      </w:r>
+    </w:p>
+    <w:p>
+      <w:pPr>
+        <w:pStyle w:val="Heading2"/>
+      </w:pPr>
+      <w:r>
+        <w:t>If asked</w:t>
+      </w:r>
+    </w:p>
+    <w:p>
+      <w:pPr>
         <w:pStyle w:val="ListBullet"/>
       </w:pPr>
       <w:r>
         <w:rPr>
           <w:b w:val="0"/>
         </w:rPr>
-        <w:t xml:space="preserve">Flagged the planted file </w:t>
+        <w:t>*Why not just use Wireshark or an existing forensics tool?* Those are great at one artifact each. The value here is the automatic join across artifacts and the shared timeline.</w:t>
+      </w:r>
+    </w:p>
+    <w:p>
+      <w:pPr>
+        <w:pStyle w:val="ListBullet"/>
+      </w:pPr>
+      <w:r>
+        <w:rPr>
+          <w:b w:val="0"/>
+        </w:rPr>
+        <w:t>*Why offline?* Because real incident response works on collected copies, and touching the live machine can destroy evidence.</w:t>
+      </w:r>
+    </w:p>
+    <w:p>
+      <w:pPr>
+        <w:pStyle w:val="ListBullet"/>
+      </w:pPr>
+      <w:r>
+        <w:rPr>
+          <w:b w:val="0"/>
+        </w:rPr>
+        <w:t>*Is this a real product?* It is a student project that demonstrates the approach on controlled test data, not a finished commercial tool.</w:t>
+      </w:r>
+    </w:p>
+    <w:p>
+      <w:pPr>
+        <w:pBdr>
+          <w:bottom w:val="single" w:sz="6" w:space="1" w:color="999999"/>
+        </w:pBdr>
+      </w:pPr>
+    </w:p>
+    <w:p>
+      <w:pPr>
+        <w:pStyle w:val="Heading1"/>
+      </w:pPr>
+      <w:r>
+        <w:t>Part 2 - Kshitij: disk forensics and catching fake timestamps</w:t>
+      </w:r>
+    </w:p>
+    <w:p>
+      <w:pPr>
+        <w:pStyle w:val="Heading2"/>
+      </w:pPr>
+      <w:r>
+        <w:t>The idea in plain words</w:t>
+      </w:r>
+    </w:p>
+    <w:p>
+      <w:r>
+        <w:rPr>
+          <w:b w:val="0"/>
+        </w:rPr>
+        <w:t>Kshitij owns the disk side: reading the Windows file system records and using them to catch timestamp tampering. This is the heart of the project's forensic logic, so take the most time here.</w:t>
+      </w:r>
+    </w:p>
+    <w:p>
+      <w:pPr>
+        <w:pStyle w:val="Heading2"/>
+      </w:pPr>
+      <w:r>
+        <w:t>Background to give the audience (keep it simple)</w:t>
+      </w:r>
+    </w:p>
+    <w:p>
+      <w:pPr>
+        <w:pStyle w:val="ListBullet"/>
+      </w:pPr>
+      <w:r>
+        <w:rPr>
+          <w:b w:val="0"/>
+        </w:rPr>
+        <w:t xml:space="preserve">Remind them of the </w:t>
+      </w:r>
+      <w:r>
+        <w:rPr>
+          <w:b/>
+        </w:rPr>
+        <w:t>two clocks</w:t>
+      </w:r>
+      <w:r>
+        <w:rPr>
+          <w:b w:val="0"/>
+        </w:rPr>
+        <w:t>: SI (easy to fake) and FN (hard to fake), both stored in a file's MFT entry.</w:t>
+      </w:r>
+    </w:p>
+    <w:p>
+      <w:pPr>
+        <w:pStyle w:val="ListBullet"/>
+      </w:pPr>
+      <w:r>
+        <w:rPr>
+          <w:b w:val="0"/>
+        </w:rPr>
+        <w:t xml:space="preserve">Remind them of the </w:t>
+      </w:r>
+      <w:r>
+        <w:rPr>
+          <w:b/>
+        </w:rPr>
+        <w:t>logbook</w:t>
+      </w:r>
+      <w:r>
+        <w:rPr>
+          <w:b w:val="0"/>
+        </w:rPr>
+        <w:t xml:space="preserve"> (the change journal) that independently records when each file was really created or changed.</w:t>
+      </w:r>
+    </w:p>
+    <w:p>
+      <w:pPr>
+        <w:pStyle w:val="ListBullet"/>
+      </w:pPr>
+      <w:r>
+        <w:rPr>
+          <w:b w:val="0"/>
+        </w:rPr>
+        <w:t xml:space="preserve">Define </w:t>
+      </w:r>
+      <w:r>
+        <w:rPr>
+          <w:b/>
+        </w:rPr>
+        <w:t>timestomping</w:t>
+      </w:r>
+      <w:r>
+        <w:rPr>
+          <w:b w:val="0"/>
+        </w:rPr>
+        <w:t xml:space="preserve"> again in one line: faking a file's timestamps so it looks like an old, trusted file.</w:t>
+      </w:r>
+    </w:p>
+    <w:p>
+      <w:pPr>
+        <w:pStyle w:val="Heading2"/>
+      </w:pPr>
+      <w:r>
+        <w:t>Why it matters to the project</w:t>
+      </w:r>
+    </w:p>
+    <w:p>
+      <w:r>
+        <w:rPr>
+          <w:b w:val="0"/>
+        </w:rPr>
+        <w:t>This part turns raw Windows data structures into the project's first headline result: "this file's timestamps were faked." Without it, CTRE would only have network data and no disk insight.</w:t>
+      </w:r>
+    </w:p>
+    <w:p>
+      <w:pPr>
+        <w:pStyle w:val="Heading2"/>
+      </w:pPr>
+      <w:r>
+        <w:t>What the code actually does</w:t>
+      </w:r>
+    </w:p>
+    <w:p>
+      <w:r>
+        <w:rPr>
+          <w:b w:val="0"/>
+        </w:rPr>
+        <w:t>There are three files here.</w:t>
+      </w:r>
+    </w:p>
+    <w:p>
+      <w:r>
+        <w:rPr>
+          <w:b/>
+        </w:rPr>
+        <w:t>`ctre/filetime.py` - making the clocks comparable.</w:t>
+      </w:r>
+      <w:r>
+        <w:rPr>
+          <w:b w:val="0"/>
+        </w:rPr>
+        <w:t xml:space="preserve"> Windows stores times in an odd format called FILETIME (a count of 100-nanosecond ticks since the year 1601). This small file converts those into normal dates so every other part of the project can compare times cleanly. It also has a helper that checks whether a timestamp has its fractional seconds set to exactly zero, which matters for one of the detection rules.</w:t>
+      </w:r>
+    </w:p>
+    <w:p>
+      <w:r>
+        <w:rPr>
+          <w:b/>
+        </w:rPr>
+        <w:t>`ctre/mft.py` - reading the file records.</w:t>
+      </w:r>
+      <w:r>
+        <w:rPr>
+          <w:b w:val="0"/>
+        </w:rPr>
+        <w:t xml:space="preserve"> Its </w:t>
       </w:r>
       <w:r>
         <w:rPr>
@@ -1082,13 +1324,57 @@
           <w:color w:val="1A534A"/>
           <w:sz w:val="20"/>
         </w:rPr>
-        <w:t>svchost.exe</w:t>
+        <w:t>parse_mft</w:t>
       </w:r>
       <w:r>
         <w:rPr>
           <w:b w:val="0"/>
         </w:rPr>
-        <w:t xml:space="preserve"> with three rules: two high (</w:t>
+        <w:t xml:space="preserve"> function reads the MFT one record at a time. For each record it:</w:t>
+      </w:r>
+    </w:p>
+    <w:p>
+      <w:pPr>
+        <w:pStyle w:val="ListBullet"/>
+      </w:pPr>
+      <w:r>
+        <w:rPr>
+          <w:b w:val="0"/>
+        </w:rPr>
+        <w:t>applies a built-in NTFS integrity fix-up (a check NTFS uses to detect records that were half-written), then</w:t>
+      </w:r>
+    </w:p>
+    <w:p>
+      <w:pPr>
+        <w:pStyle w:val="ListBullet"/>
+      </w:pPr>
+      <w:r>
+        <w:rPr>
+          <w:b w:val="0"/>
+        </w:rPr>
+        <w:t>pulls out both the SI and FN timestamp sets and the file name.</w:t>
+      </w:r>
+    </w:p>
+    <w:p>
+      <w:r>
+        <w:rPr>
+          <w:b w:val="0"/>
+        </w:rPr>
+        <w:t>If a record is damaged or malformed, it is skipped rather than crashing the run, because evidence files cannot be trusted to be perfect.</w:t>
+      </w:r>
+    </w:p>
+    <w:p>
+      <w:r>
+        <w:rPr>
+          <w:b/>
+        </w:rPr>
+        <w:t>`ctre/usnjrnl.py` - reading the logbook.</w:t>
+      </w:r>
+      <w:r>
+        <w:rPr>
+          <w:b w:val="0"/>
+        </w:rPr>
+        <w:t xml:space="preserve"> Its </w:t>
       </w:r>
       <w:r>
         <w:rPr>
@@ -1097,13 +1383,49 @@
           <w:color w:val="1A534A"/>
           <w:sz w:val="20"/>
         </w:rPr>
-        <w:t>SI_BEFORE_FN</w:t>
+        <w:t>parse_usnjrnl</w:t>
       </w:r>
       <w:r>
         <w:rPr>
           <w:b w:val="0"/>
         </w:rPr>
-        <w:t xml:space="preserve">, </w:t>
+        <w:t xml:space="preserve"> function reads the change journal. Two real-world details are worth mentioning:</w:t>
+      </w:r>
+    </w:p>
+    <w:p>
+      <w:pPr>
+        <w:pStyle w:val="ListBullet"/>
+      </w:pPr>
+      <w:r>
+        <w:rPr>
+          <w:b w:val="0"/>
+        </w:rPr>
+        <w:t>A real journal can be several gigabytes, most of it empty padding, so the code memory-maps the file and skips over the empty regions instead of loading it all into memory. A one-gigabyte sparse test file reads in about 4.5 seconds.</w:t>
+      </w:r>
+    </w:p>
+    <w:p>
+      <w:pPr>
+        <w:pStyle w:val="ListBullet"/>
+      </w:pPr>
+      <w:r>
+        <w:rPr>
+          <w:b w:val="0"/>
+        </w:rPr>
+        <w:t>Each journal entry carries a "reason" (create, rename, write, delete) and a time, which the detector relies on.</w:t>
+      </w:r>
+    </w:p>
+    <w:p>
+      <w:r>
+        <w:rPr>
+          <w:b/>
+        </w:rPr>
+        <w:t>`ctre/timestomp.py` - the detection itself.</w:t>
+      </w:r>
+      <w:r>
+        <w:rPr>
+          <w:b w:val="0"/>
+        </w:rPr>
+        <w:t xml:space="preserve"> Its </w:t>
       </w:r>
       <w:r>
         <w:rPr>
@@ -1112,14 +1434,19 @@
           <w:color w:val="1A534A"/>
           <w:sz w:val="20"/>
         </w:rPr>
-        <w:t>SI_BEFORE_JRNL</w:t>
+        <w:t>analyze</w:t>
       </w:r>
       <w:r>
         <w:rPr>
           <w:b w:val="0"/>
         </w:rPr>
-        <w:t>) and one medium (</w:t>
-      </w:r>
+        <w:t xml:space="preserve"> function compares the clocks and the logbook and raises findings. The four rules (this is Figure 2 in the paper) are:</w:t>
+      </w:r>
+    </w:p>
+    <w:p>
+      <w:pPr>
+        <w:pStyle w:val="ListBullet"/>
+      </w:pPr>
       <w:r>
         <w:rPr>
           <w:rFonts w:ascii="Consolas" w:hAnsi="Consolas"/>
@@ -1127,47 +1454,19 @@
           <w:color w:val="1A534A"/>
           <w:sz w:val="20"/>
         </w:rPr>
-        <w:t>ZERO_SUBSECOND</w:t>
+        <w:t>SI_BEFORE_FN</w:t>
       </w:r>
       <w:r>
         <w:rPr>
           <w:b w:val="0"/>
         </w:rPr>
-        <w:t>).</w:t>
+        <w:t xml:space="preserve"> (HIGH): the file's easy clock says it was created before its hard clock. A file cannot be created before its own name record, so the easy clock was pushed into the past.</w:t>
       </w:r>
     </w:p>
     <w:p>
       <w:pPr>
         <w:pStyle w:val="ListBullet"/>
       </w:pPr>
-      <w:r>
-        <w:rPr>
-          <w:b w:val="0"/>
-        </w:rPr>
-        <w:t>The benign file was not flagged.</w:t>
-      </w:r>
-    </w:p>
-    <w:p>
-      <w:pPr>
-        <w:pStyle w:val="ListBullet"/>
-      </w:pPr>
-      <w:r>
-        <w:rPr>
-          <w:b w:val="0"/>
-        </w:rPr>
-        <w:t>Linked the outbound transfer of about 160 KB to the disk change for that file.</w:t>
-      </w:r>
-    </w:p>
-    <w:p>
-      <w:pPr>
-        <w:pStyle w:val="ListBullet"/>
-      </w:pPr>
-      <w:r>
-        <w:rPr>
-          <w:b w:val="0"/>
-        </w:rPr>
-        <w:t xml:space="preserve">The timeline shows the story: </w:t>
-      </w:r>
       <w:r>
         <w:rPr>
           <w:rFonts w:ascii="Consolas" w:hAnsi="Consolas"/>
@@ -1175,14 +1474,19 @@
           <w:color w:val="1A534A"/>
           <w:sz w:val="20"/>
         </w:rPr>
-        <w:t>svchost.exe</w:t>
+        <w:t>SI_BEFORE_JRNL</w:t>
       </w:r>
       <w:r>
         <w:rPr>
           <w:b w:val="0"/>
         </w:rPr>
-        <w:t xml:space="preserve"> claims a 2019 creation in the </w:t>
-      </w:r>
+        <w:t xml:space="preserve"> (HIGH): the easy clock predates the logbook's record of the file being created. The logbook cannot mention a file before it exists.</w:t>
+      </w:r>
+    </w:p>
+    <w:p>
+      <w:pPr>
+        <w:pStyle w:val="ListBullet"/>
+      </w:pPr>
       <w:r>
         <w:rPr>
           <w:rFonts w:ascii="Consolas" w:hAnsi="Consolas"/>
@@ -1190,30 +1494,19 @@
           <w:color w:val="1A534A"/>
           <w:sz w:val="20"/>
         </w:rPr>
-        <w:t>$MFT</w:t>
+        <w:t>ZERO_SUBSECOND</w:t>
       </w:r>
       <w:r>
         <w:rPr>
           <w:b w:val="0"/>
         </w:rPr>
-        <w:t>, the journal records its real creation in 2026, then a DNS lookup, a TLS handshake, and the transfer to the external host.</w:t>
+        <w:t xml:space="preserve"> (MEDIUM): several of the easy-clock times have their fractional seconds set to exactly zero, which many timestomping tools produce.</w:t>
       </w:r>
     </w:p>
     <w:p>
       <w:pPr>
-        <w:pStyle w:val="Heading2"/>
-      </w:pPr>
-      <w:r>
-        <w:t>Short script</w:t>
-      </w:r>
-    </w:p>
-    <w:p>
-      <w:r>
-        <w:rPr>
-          <w:b w:val="0"/>
-        </w:rPr>
-        <w:t xml:space="preserve">"You run it and this page opens. You can load the sample case with one click and hit run. Here is what it found: it caught the file we planted, </w:t>
-      </w:r>
+        <w:pStyle w:val="ListBullet"/>
+      </w:pPr>
       <w:r>
         <w:rPr>
           <w:rFonts w:ascii="Consolas" w:hAnsi="Consolas"/>
@@ -1221,69 +1514,60 @@
           <w:color w:val="1A534A"/>
           <w:sz w:val="20"/>
         </w:rPr>
-        <w:t>svchost.exe</w:t>
+        <w:t>NO_JRNL_FOR_CHANGE</w:t>
       </w:r>
       <w:r>
         <w:rPr>
           <w:b w:val="0"/>
         </w:rPr>
-        <w:t>, with three separate rules, it left the normal file alone, and it tied the outbound transfer to the moment that file changed. The timeline reads like a story: the file claims to be from 2019, the journal says it is actually new, and then the data leaves. Everything you see here is backed by 20 passing tests, and we checked our network parser against a separate library to be sure the numbers are real."</w:t>
+        <w:t xml:space="preserve"> (MEDIUM): the easy clock says the file was modified more recently than anything in the logbook for that file, a change the logbook never saw.</w:t>
       </w:r>
     </w:p>
     <w:p>
-      <w:pPr>
-        <w:pStyle w:val="Heading2"/>
-      </w:pPr>
-      <w:r>
-        <w:t>If asked</w:t>
+      <w:r>
+        <w:rPr>
+          <w:b w:val="0"/>
+        </w:rPr>
+        <w:t>Each finding includes a severity and a sentence explaining it.</w:t>
       </w:r>
     </w:p>
     <w:p>
       <w:pPr>
-        <w:pStyle w:val="ListBullet"/>
-      </w:pPr>
-      <w:r>
-        <w:rPr>
-          <w:b w:val="0"/>
-        </w:rPr>
-        <w:t>*Is the local web server a security risk?* No, it is loopback-only and has several guards against other sites reaching it; details above.</w:t>
+        <w:pStyle w:val="Heading2"/>
+      </w:pPr>
+      <w:r>
+        <w:t>The clever part worth emphasizing (avoiding false alarms)</w:t>
       </w:r>
     </w:p>
     <w:p>
-      <w:pPr>
-        <w:pStyle w:val="ListBullet"/>
-      </w:pPr>
       <w:r>
         <w:rPr>
           <w:b w:val="0"/>
         </w:rPr>
-        <w:t>*How confident are you in the results?* The pipeline is proven on controlled data, not on a real intrusion. The tests show it works end to end and fires on a known case; real-world detection rates would need captured cases to measure.</w:t>
+        <w:t>Two of these rules would wrongly accuse normal files without extra care, and fixing that is a genuine engineering highlight:</w:t>
       </w:r>
     </w:p>
     <w:p>
       <w:pPr>
-        <w:pBdr>
-          <w:bottom w:val="single" w:sz="6" w:space="1" w:color="999999"/>
-        </w:pBdr>
-      </w:pPr>
-    </w:p>
-    <w:p>
-      <w:pPr>
-        <w:pStyle w:val="Heading1"/>
-      </w:pPr>
-      <w:r>
-        <w:t>The live demo (one driver, the rest answer)</w:t>
-      </w:r>
-    </w:p>
-    <w:p>
-      <w:pPr>
-        <w:pStyle w:val="ListNumber"/>
+        <w:pStyle w:val="ListBullet"/>
       </w:pPr>
       <w:r>
         <w:rPr>
           <w:b w:val="0"/>
         </w:rPr>
-        <w:t xml:space="preserve">Run </w:t>
+        <w:t xml:space="preserve">The logbook is a </w:t>
+      </w:r>
+      <w:r>
+        <w:rPr>
+          <w:b/>
+        </w:rPr>
+        <w:t>ring buffer</w:t>
+      </w:r>
+      <w:r>
+        <w:rPr>
+          <w:b w:val="0"/>
+        </w:rPr>
+        <w:t xml:space="preserve">: it only keeps recent history and overwrites the oldest entries. So for an old file, the earliest surviving logbook entry is usually not its creation. The </w:t>
       </w:r>
       <w:r>
         <w:rPr>
@@ -1292,97 +1576,236 @@
           <w:color w:val="1A534A"/>
           <w:sz w:val="20"/>
         </w:rPr>
-        <w:t>python -m ctre</w:t>
+        <w:t>SI_BEFORE_JRNL</w:t>
       </w:r>
       <w:r>
         <w:rPr>
           <w:b w:val="0"/>
         </w:rPr>
-        <w:t xml:space="preserve"> to open the web page.</w:t>
+        <w:t xml:space="preserve"> rule therefore only fires when the logbook actually holds a *creation* entry for the file, not just an old edit.</w:t>
       </w:r>
     </w:p>
     <w:p>
       <w:pPr>
-        <w:pStyle w:val="ListNumber"/>
+        <w:pStyle w:val="ListBullet"/>
       </w:pPr>
       <w:r>
         <w:rPr>
           <w:b w:val="0"/>
         </w:rPr>
-        <w:t xml:space="preserve">Click </w:t>
+        <w:t xml:space="preserve">Windows </w:t>
       </w:r>
       <w:r>
         <w:rPr>
           <w:b/>
         </w:rPr>
-        <w:t>Load sample case</w:t>
+        <w:t>reuses MFT record numbers</w:t>
       </w:r>
       <w:r>
         <w:rPr>
           <w:b w:val="0"/>
         </w:rPr>
-        <w:t xml:space="preserve">, then </w:t>
-      </w:r>
-      <w:r>
-        <w:rPr>
-          <w:b/>
-        </w:rPr>
-        <w:t>Run analysis</w:t>
-      </w:r>
-      <w:r>
-        <w:rPr>
-          <w:b w:val="0"/>
-        </w:rPr>
-        <w:t>.</w:t>
+        <w:t xml:space="preserve"> after a file is deleted. That means logbook history from a long-gone file can look like it belongs to the current file in the same slot. The detector also checks a "sequence number" that tells the old and new occupants apart, so a deleted file's history is not blamed on its replacement.</w:t>
       </w:r>
     </w:p>
     <w:p>
-      <w:pPr>
-        <w:pStyle w:val="ListNumber"/>
-      </w:pPr>
       <w:r>
         <w:rPr>
           <w:b w:val="0"/>
         </w:rPr>
-        <w:t xml:space="preserve">Read the </w:t>
-      </w:r>
-      <w:r>
-        <w:rPr>
-          <w:b/>
-        </w:rPr>
-        <w:t>What the engine found</w:t>
-      </w:r>
-      <w:r>
-        <w:rPr>
-          <w:b w:val="0"/>
-        </w:rPr>
-        <w:t xml:space="preserve"> summary out loud.</w:t>
+        <w:t>Both of these have their own tests, so they cannot silently regress.</w:t>
       </w:r>
     </w:p>
     <w:p>
       <w:pPr>
-        <w:pStyle w:val="ListNumber"/>
-      </w:pPr>
-      <w:r>
-        <w:rPr>
-          <w:b w:val="0"/>
-        </w:rPr>
-        <w:t xml:space="preserve">Scroll to the </w:t>
-      </w:r>
-      <w:r>
-        <w:rPr>
-          <w:b/>
-        </w:rPr>
-        <w:t>findings</w:t>
-      </w:r>
-      <w:r>
-        <w:rPr>
-          <w:b w:val="0"/>
-        </w:rPr>
-        <w:t xml:space="preserve"> (point out the two high-severity rules on</w:t>
+        <w:pStyle w:val="Heading2"/>
+      </w:pPr>
+      <w:r>
+        <w:t>Script</w:t>
       </w:r>
     </w:p>
     <w:p>
+      <w:r>
+        <w:rPr>
+          <w:b w:val="0"/>
+        </w:rPr>
+        <w:t>"Windows keeps two timestamps for every file. One is easy to change, one is not. On top of that, the system keeps a logbook of when files really change. Our detector plays these against each other. If the easy clock claims a file is from 2019, but the hard clock and the logbook both say it actually appeared last week, that gap is the tampering, and we flag it. This flowchart shows the exact checks we run, and each one comes with a severity and a plain-English reason. The part I am proudest of is that we handle the awkward real-world cases: the logbook fills up and forgets old history, and Windows recycles file slots, so we added guards so that normal old files are not wrongly accused."</w:t>
+      </w:r>
+    </w:p>
+    <w:p>
+      <w:pPr>
+        <w:pStyle w:val="Heading2"/>
+      </w:pPr>
+      <w:r>
+        <w:t>Analogy</w:t>
+      </w:r>
+    </w:p>
+    <w:p>
+      <w:r>
+        <w:rPr>
+          <w:b w:val="0"/>
+        </w:rPr>
+        <w:t>A painting (the file) has a date written on the front by the owner (easy to change) and a date stamped on the back by the gallery (hard to change), plus the gallery's intake register (the logbook). If the front says 1850 but the back and the register say the painting arrived last month, it was backdated.</w:t>
+      </w:r>
+    </w:p>
+    <w:p>
+      <w:pPr>
+        <w:pStyle w:val="Heading2"/>
+      </w:pPr>
+      <w:r>
+        <w:t>If asked</w:t>
+      </w:r>
+    </w:p>
+    <w:p>
+      <w:pPr>
+        <w:pStyle w:val="ListBullet"/>
+      </w:pPr>
+      <w:r>
+        <w:rPr>
+          <w:b w:val="0"/>
+        </w:rPr>
+        <w:t>*Could innocent files get flagged?* The two HIGH rules have the guards above. The ZERO_SUBSECOND rule is softer: files unzipped from an archive or copied from an older file system can also have zeroed fractions, so we mark it MEDIUM and call it a lead, not proof.</w:t>
+      </w:r>
+    </w:p>
+    <w:p>
+      <w:pPr>
+        <w:pStyle w:val="ListBullet"/>
+      </w:pPr>
+      <w:r>
+        <w:rPr>
+          <w:b w:val="0"/>
+        </w:rPr>
+        <w:t>*What if the journal is enormous?* It is memory-mapped and the empty space is skipped, so size is not a problem.</w:t>
+      </w:r>
+    </w:p>
+    <w:p>
+      <w:pPr>
+        <w:pStyle w:val="ListBullet"/>
+      </w:pPr>
+      <w:r>
+        <w:rPr>
+          <w:b w:val="0"/>
+        </w:rPr>
+        <w:t>*Do you need the whole disk?* No, just the extracted MFT and journal files.</w:t>
+      </w:r>
+    </w:p>
+    <w:p>
+      <w:pPr>
+        <w:pBdr>
+          <w:bottom w:val="single" w:sz="6" w:space="1" w:color="999999"/>
+        </w:pBdr>
+      </w:pPr>
+    </w:p>
+    <w:p>
+      <w:pPr>
+        <w:pStyle w:val="Heading1"/>
+      </w:pPr>
+      <w:r>
+        <w:t>Part 3 - Moksh: network evidence and connecting it to the disk</w:t>
+      </w:r>
+    </w:p>
+    <w:p>
+      <w:pPr>
+        <w:pStyle w:val="Heading2"/>
+      </w:pPr>
+      <w:r>
+        <w:t>The idea in plain words</w:t>
+      </w:r>
+    </w:p>
+    <w:p>
+      <w:r>
+        <w:rPr>
+          <w:b w:val="0"/>
+        </w:rPr>
+        <w:t>Moksh owns the network side: reading the packet capture without decrypting it, and then connecting network activity to the disk activity Kshitij found. This is where the two halves of the project meet.</w:t>
+      </w:r>
+    </w:p>
+    <w:p>
+      <w:pPr>
+        <w:pStyle w:val="Heading2"/>
+      </w:pPr>
+      <w:r>
+        <w:t>Background to give the audience</w:t>
+      </w:r>
+    </w:p>
+    <w:p>
+      <w:pPr>
+        <w:pStyle w:val="ListBullet"/>
+      </w:pPr>
+      <w:r>
+        <w:rPr>
+          <w:b w:val="0"/>
+        </w:rPr>
+        <w:t>A packet capture is a recording of network traffic.</w:t>
+      </w:r>
+    </w:p>
+    <w:p>
+      <w:pPr>
+        <w:pStyle w:val="ListBullet"/>
+      </w:pPr>
+      <w:r>
+        <w:rPr>
+          <w:b w:val="0"/>
+        </w:rPr>
+        <w:t>Most traffic is encrypted, so you can see the envelope (who, when, how big) but not the contents. We deliberately stay with the envelope.</w:t>
+      </w:r>
+    </w:p>
+    <w:p>
+      <w:pPr>
+        <w:pStyle w:val="ListBullet"/>
+      </w:pPr>
+      <w:r>
+        <w:rPr>
+          <w:b w:val="0"/>
+        </w:rPr>
+        <w:t>Even on encrypted connections, a couple of things are sent in plain text: the website name looked up in DNS, and the server name in the start of a secure connection. We can read those.</w:t>
+      </w:r>
+    </w:p>
+    <w:p>
+      <w:pPr>
+        <w:pStyle w:val="Heading2"/>
+      </w:pPr>
+      <w:r>
+        <w:t>Why it matters to the project</w:t>
+      </w:r>
+    </w:p>
+    <w:p>
+      <w:r>
+        <w:rPr>
+          <w:b w:val="0"/>
+        </w:rPr>
+        <w:t>This part produces the project's second headline result: "a large transfer left the machine right when a suspicious file changed on disk." It depends on the disk side (for the "when a file changed" part), which is why Moksh presents after Kshitij.</w:t>
+      </w:r>
+    </w:p>
+    <w:p>
+      <w:pPr>
+        <w:pStyle w:val="Heading2"/>
+      </w:pPr>
+      <w:r>
+        <w:t>What the code actually does</w:t>
+      </w:r>
+    </w:p>
+    <w:p>
+      <w:r>
+        <w:rPr>
+          <w:b w:val="0"/>
+        </w:rPr>
+        <w:t>Two files.</w:t>
+      </w:r>
+    </w:p>
+    <w:p>
+      <w:r>
+        <w:rPr>
+          <w:b/>
+        </w:rPr>
+        <w:t>`ctre/pcap_meta.py` - reading the traffic.</w:t>
+      </w:r>
+      <w:r>
+        <w:rPr>
+          <w:b w:val="0"/>
+        </w:rPr>
+        <w:t xml:space="preserve"> Its </w:t>
+      </w:r>
       <w:r>
         <w:rPr>
           <w:rFonts w:ascii="Consolas" w:hAnsi="Consolas"/>
@@ -1390,65 +1813,39 @@
           <w:color w:val="1A534A"/>
           <w:sz w:val="20"/>
         </w:rPr>
-        <w:t>svchost.exe</w:t>
+        <w:t>parse_pcap</w:t>
       </w:r>
       <w:r>
         <w:rPr>
           <w:b w:val="0"/>
         </w:rPr>
-        <w:t xml:space="preserve">), then the </w:t>
+        <w:t xml:space="preserve"> function reads the capture and builds a </w:t>
       </w:r>
       <w:r>
         <w:rPr>
           <w:b/>
         </w:rPr>
-        <w:t>correlation</w:t>
+        <w:t>flow</w:t>
       </w:r>
       <w:r>
         <w:rPr>
           <w:b w:val="0"/>
         </w:rPr>
-        <w:t xml:space="preserve">, then the </w:t>
-      </w:r>
-      <w:r>
-        <w:rPr>
-          <w:b/>
-        </w:rPr>
-        <w:t>timeline</w:t>
-      </w:r>
-      <w:r>
-        <w:rPr>
-          <w:b w:val="0"/>
-        </w:rPr>
-        <w:t xml:space="preserve">. 5. Toggle the timeline source filters to show disk versus network events. 6. Click </w:t>
-      </w:r>
-      <w:r>
-        <w:rPr>
-          <w:b/>
-        </w:rPr>
-        <w:t>Download HTML report</w:t>
-      </w:r>
-      <w:r>
-        <w:rPr>
-          <w:b w:val="0"/>
-        </w:rPr>
-        <w:t xml:space="preserve"> to show the shareable output.</w:t>
+        <w:t xml:space="preserve"> record for each connection. A flow summarizes one conversation: the two machines, the ports, how many packets and bytes went each way, and the first and last time it was seen. It also extracts two plain-text details without any decryption: DNS query names (the website names being looked up) and the server name offered at the start of a secure connection (called the SNI). It explicitly does no decryption anywhere.</w:t>
       </w:r>
     </w:p>
     <w:p>
       <w:r>
         <w:rPr>
+          <w:b/>
+        </w:rPr>
+        <w:t>`ctre/correlate.py` - joining the worlds and building the timeline.</w:t>
+      </w:r>
+      <w:r>
+        <w:rPr>
           <w:b w:val="0"/>
         </w:rPr>
-        <w:t>If anything fails live, fall back to the screenshots and the report PDF.</w:t>
-      </w:r>
-    </w:p>
-    <w:p>
-      <w:pPr>
-        <w:pStyle w:val="Heading1"/>
-      </w:pPr>
-      <w:r>
-        <w:t>Quick reference</w:t>
+        <w:t xml:space="preserve"> This has two jobs:</w:t>
       </w:r>
     </w:p>
     <w:p>
@@ -1462,13 +1859,13 @@
           <w:color w:val="1A534A"/>
           <w:sz w:val="20"/>
         </w:rPr>
-        <w:t>$MFT</w:t>
+        <w:t>correlate_exfil</w:t>
       </w:r>
       <w:r>
         <w:rPr>
           <w:b w:val="0"/>
         </w:rPr>
-        <w:t>: NTFS master file table; one record per file, with its timestamps.</w:t>
+        <w:t xml:space="preserve"> looks for a large outbound flow whose start time is within a chosen window (five minutes by default) of a disk change recorded in the logbook. When it finds one, it records a correlation: "this transfer lines up with this file change." This is Figure 3 in the paper.</w:t>
       </w:r>
     </w:p>
     <w:p>
@@ -1482,24 +1879,171 @@
           <w:color w:val="1A534A"/>
           <w:sz w:val="20"/>
         </w:rPr>
-        <w:t>$UsnJrnl:$J</w:t>
+        <w:t>build_timeline</w:t>
       </w:r>
       <w:r>
         <w:rPr>
           <w:b w:val="0"/>
         </w:rPr>
-        <w:t>: NTFS change journal; append-only log of filesystem changes.</w:t>
+        <w:t xml:space="preserve"> merges every event, disk and network, into one list sorted by time, so the story reads top to bottom.</w:t>
       </w:r>
     </w:p>
     <w:p>
       <w:pPr>
+        <w:pStyle w:val="Heading2"/>
+      </w:pPr>
+      <w:r>
+        <w:t>Why keyless analysis is the right call (make this a feature, not a gap)</w:t>
+      </w:r>
+    </w:p>
+    <w:p>
+      <w:r>
+        <w:rPr>
+          <w:b w:val="0"/>
+        </w:rPr>
+        <w:t>The original project brief included reading encryption keys from memory and decrypting the traffic. The team left that out on purpose, because the same code would decrypt anyone's private traffic, which is an eavesdropping tool. The point to make: we do not need it. The theft signal is the size, timing, and destination of a transfer, and all of those are visible without decryption. This shows a deliberate ethical and security decision.</w:t>
+      </w:r>
+    </w:p>
+    <w:p>
+      <w:pPr>
+        <w:pStyle w:val="Heading2"/>
+      </w:pPr>
+      <w:r>
+        <w:t>Script</w:t>
+      </w:r>
+    </w:p>
+    <w:p>
+      <w:r>
+        <w:rPr>
+          <w:b w:val="0"/>
+        </w:rPr>
+        <w:t>"We do not break encryption, and we do not need to. A recording of the traffic still tells us who the machine talked to, when, and how much data left, plus the website names from DNS and the server name in the secure handshake. Our tool takes every large outbound transfer and asks: did a file change on disk right around the same time? When the answer is yes, that is the classic shape of data being staged and then stolen, and we put it on the timeline right next to the disk events. So Kshitij's side tells us a file was tampered with, and my side can show that same file's data then left the machine."</w:t>
+      </w:r>
+    </w:p>
+    <w:p>
+      <w:pPr>
+        <w:pStyle w:val="Heading2"/>
+      </w:pPr>
+      <w:r>
+        <w:t>Analogy</w:t>
+      </w:r>
+    </w:p>
+    <w:p>
+      <w:r>
+        <w:rPr>
+          <w:b w:val="0"/>
+        </w:rPr>
+        <w:t>A warehouse has a stock log (the disk changes) and a loading-dock camera (the network capture). You cannot see inside the boxes being loaded (encryption), but if a box appears in the stock log and a truck of about the same size pulls out two minutes later, you have a strong story without opening the box.</w:t>
+      </w:r>
+    </w:p>
+    <w:p>
+      <w:pPr>
+        <w:pStyle w:val="Heading2"/>
+      </w:pPr>
+      <w:r>
+        <w:t>If asked</w:t>
+      </w:r>
+    </w:p>
+    <w:p>
+      <w:pPr>
         <w:pStyle w:val="ListBullet"/>
       </w:pPr>
       <w:r>
         <w:rPr>
           <w:b w:val="0"/>
         </w:rPr>
-        <w:t xml:space="preserve">SI vs FN: </w:t>
+        <w:t>*How do you know a transfer is "outbound" and "large"?* The flow records byte counts in each direction, and we apply a size threshold that the user can change in the app.</w:t>
+      </w:r>
+    </w:p>
+    <w:p>
+      <w:pPr>
+        <w:pStyle w:val="ListBullet"/>
+      </w:pPr>
+      <w:r>
+        <w:rPr>
+          <w:b w:val="0"/>
+        </w:rPr>
+        <w:t>*Could slow, trickled-out theft be missed?* Yes. Data sent very slowly over a long time can stay under the size and time thresholds. That is a known limit.</w:t>
+      </w:r>
+    </w:p>
+    <w:p>
+      <w:pPr>
+        <w:pStyle w:val="ListBullet"/>
+      </w:pPr>
+      <w:r>
+        <w:rPr>
+          <w:b w:val="0"/>
+        </w:rPr>
+        <w:t>*What formats does it read?* The common capture format with standard Ethernet and IPv4. It tells the user to convert other formats rather than failing silently.</w:t>
+      </w:r>
+    </w:p>
+    <w:p>
+      <w:pPr>
+        <w:pBdr>
+          <w:bottom w:val="single" w:sz="6" w:space="1" w:color="999999"/>
+        </w:pBdr>
+      </w:pPr>
+    </w:p>
+    <w:p>
+      <w:pPr>
+        <w:pStyle w:val="Heading1"/>
+      </w:pPr>
+      <w:r>
+        <w:t>Part 4 - Aranck: the app, testing, safety, and results</w:t>
+      </w:r>
+    </w:p>
+    <w:p>
+      <w:pPr>
+        <w:pStyle w:val="Heading2"/>
+      </w:pPr>
+      <w:r>
+        <w:t>The idea in plain words</w:t>
+      </w:r>
+    </w:p>
+    <w:p>
+      <w:r>
+        <w:rPr>
+          <w:b w:val="0"/>
+        </w:rPr>
+        <w:t>Aranck makes the project real and trustworthy: the app people actually use, the proof that it works, the safety of running it, and the results on the test case. This is also the part that drives the live demo.</w:t>
+      </w:r>
+    </w:p>
+    <w:p>
+      <w:pPr>
+        <w:pStyle w:val="Heading2"/>
+      </w:pPr>
+      <w:r>
+        <w:t>Why it matters to the project</w:t>
+      </w:r>
+    </w:p>
+    <w:p>
+      <w:r>
+        <w:rPr>
+          <w:b w:val="0"/>
+        </w:rPr>
+        <w:t>A correct analysis is useless if nobody can run it and nobody can trust it. This part is what turns the engine into something presentable and believable.</w:t>
+      </w:r>
+    </w:p>
+    <w:p>
+      <w:pPr>
+        <w:pStyle w:val="Heading2"/>
+      </w:pPr>
+      <w:r>
+        <w:t>What the code actually does</w:t>
+      </w:r>
+    </w:p>
+    <w:p>
+      <w:r>
+        <w:rPr>
+          <w:b/>
+        </w:rPr>
+        <w:t>The app: `ctre/web.py` and `ctre/web/`.</w:t>
+      </w:r>
+      <w:r>
+        <w:rPr>
+          <w:b w:val="0"/>
+        </w:rPr>
+        <w:t xml:space="preserve"> Running the tool with no arguments starts a small web server on your own machine and opens a page in the browser. The page (in </w:t>
       </w:r>
       <w:r>
         <w:rPr>
@@ -1508,13 +2052,13 @@
           <w:color w:val="1A534A"/>
           <w:sz w:val="20"/>
         </w:rPr>
-        <w:t>$STANDARD_INFORMATION</w:t>
+        <w:t>ctre/web/</w:t>
       </w:r>
       <w:r>
         <w:rPr>
           <w:b w:val="0"/>
         </w:rPr>
-        <w:t xml:space="preserve"> (easy to fake) vs </w:t>
+        <w:t xml:space="preserve">) explains the project as you scroll: an overview with the pipeline diagram, numbered steps, a one-click sample case, the results, and a reference section with the rules and a glossary. After a run it prints a plain summary of what it found. Behind the page, </w:t>
       </w:r>
       <w:r>
         <w:rPr>
@@ -1523,35 +2067,41 @@
           <w:color w:val="1A534A"/>
           <w:sz w:val="20"/>
         </w:rPr>
-        <w:t>$FILE_NAME</w:t>
+        <w:t>ctre/service.py</w:t>
       </w:r>
       <w:r>
         <w:rPr>
           <w:b w:val="0"/>
         </w:rPr>
-        <w:t xml:space="preserve"> (harder).</w:t>
+        <w:t xml:space="preserve"> runs the exact same analysis as the command line, so the app and the command line always agree.</w:t>
       </w:r>
     </w:p>
     <w:p>
-      <w:pPr>
-        <w:pStyle w:val="ListBullet"/>
-      </w:pPr>
+      <w:r>
+        <w:rPr>
+          <w:b/>
+        </w:rPr>
+        <w:t>The report: `ctre/report.py`.</w:t>
+      </w:r>
       <w:r>
         <w:rPr>
           <w:b w:val="0"/>
         </w:rPr>
-        <w:t>Timestomping: faking a file's timestamps to hide when it was made or changed.</w:t>
+        <w:t xml:space="preserve"> Produces a single self-contained HTML report and a JSON file. Every piece of text taken from the evidence is escaped before it is written, so a booby-trapped file name cannot inject anything into the report.</w:t>
       </w:r>
     </w:p>
     <w:p>
-      <w:pPr>
-        <w:pStyle w:val="ListBullet"/>
-      </w:pPr>
+      <w:r>
+        <w:rPr>
+          <w:b/>
+        </w:rPr>
+        <w:t>The safety of the local server</w:t>
+      </w:r>
       <w:r>
         <w:rPr>
           <w:b w:val="0"/>
         </w:rPr>
-        <w:t>Flow: one network connection summarized by endpoints, ports, timing, bytes.</w:t>
+        <w:t xml:space="preserve"> (worth spelling out, because "a web server" can sound risky):</w:t>
       </w:r>
     </w:p>
     <w:p>
@@ -1562,7 +2112,7 @@
         <w:rPr>
           <w:b w:val="0"/>
         </w:rPr>
-        <w:t>SNI: the server hostname sent in the clear in a TLS handshake.</w:t>
+        <w:t>It listens only on your own machine (the loopback address), not on the network.</w:t>
       </w:r>
     </w:p>
     <w:p>
@@ -1573,21 +2123,97 @@
         <w:rPr>
           <w:b w:val="0"/>
         </w:rPr>
-        <w:t>Exfiltration: moving data off the system.</w:t>
+        <w:t>It checks the address it was asked for, so another site cannot reach it by name.</w:t>
       </w:r>
     </w:p>
     <w:p>
+      <w:pPr>
+        <w:pStyle w:val="ListBullet"/>
+      </w:pPr>
       <w:r>
         <w:rPr>
           <w:b w:val="0"/>
         </w:rPr>
-        <w:t>Commands:</w:t>
+        <w:t>It requires a special header on every request, which stops other websites open in your browser from quietly driving it.</w:t>
       </w:r>
     </w:p>
     <w:p>
       <w:pPr>
         <w:pStyle w:val="ListBullet"/>
       </w:pPr>
+      <w:r>
+        <w:rPr>
+          <w:b w:val="0"/>
+        </w:rPr>
+        <w:t>It sends a strict policy that limits what the page can load, and it deletes any uploaded evidence when it stops.</w:t>
+      </w:r>
+    </w:p>
+    <w:p>
+      <w:pPr>
+        <w:pStyle w:val="ListBullet"/>
+      </w:pPr>
+      <w:r>
+        <w:rPr>
+          <w:b w:val="0"/>
+        </w:rPr>
+        <w:t>Text from the evidence is always placed as plain text, never as code.</w:t>
+      </w:r>
+    </w:p>
+    <w:p>
+      <w:r>
+        <w:rPr>
+          <w:b/>
+        </w:rPr>
+        <w:t>The proof: `ctre/gen_testdata.py` and the `tests/` folder.</w:t>
+      </w:r>
+      <w:r>
+        <w:rPr>
+          <w:b w:val="0"/>
+        </w:rPr>
+        <w:t xml:space="preserve"> Because the team did not want to rely on real evidence, there is a generator that writes fake artifacts in the exact formats the parsers read, so the generator and the parsers check each other. It plants one timestomped file and one timed transfer, so there is a known correct answer. There are </w:t>
+      </w:r>
+      <w:r>
+        <w:rPr>
+          <w:b/>
+        </w:rPr>
+        <w:t>20 tests</w:t>
+      </w:r>
+      <w:r>
+        <w:rPr>
+          <w:b w:val="0"/>
+        </w:rPr>
+        <w:t xml:space="preserve"> covering the time math, each parser, the four detection rules, the correlation, the report escaping, and a full upload-run-download cycle against the live server. All pass. On top of that, the network parser was cross-checked against scapy, a separate and widely used packet library, and the packet count, DNS name, server name, and byte totals all matched.</w:t>
+      </w:r>
+    </w:p>
+    <w:p>
+      <w:pPr>
+        <w:pStyle w:val="Heading2"/>
+      </w:pPr>
+      <w:r>
+        <w:t>The results to report (the sample case)</w:t>
+      </w:r>
+    </w:p>
+    <w:p>
+      <w:pPr>
+        <w:pStyle w:val="ListBullet"/>
+      </w:pPr>
+      <w:r>
+        <w:rPr>
+          <w:b w:val="0"/>
+        </w:rPr>
+        <w:t>Parsed 2 MFT entries, 4 logbook records, 122 packets forming 2 flows.</w:t>
+      </w:r>
+    </w:p>
+    <w:p>
+      <w:pPr>
+        <w:pStyle w:val="ListBullet"/>
+      </w:pPr>
+      <w:r>
+        <w:rPr>
+          <w:b w:val="0"/>
+        </w:rPr>
+        <w:t xml:space="preserve">Flagged the planted file </w:t>
+      </w:r>
       <w:r>
         <w:rPr>
           <w:rFonts w:ascii="Consolas" w:hAnsi="Consolas"/>
@@ -1595,19 +2221,14 @@
           <w:color w:val="1A534A"/>
           <w:sz w:val="20"/>
         </w:rPr>
-        <w:t>python -m ctre</w:t>
+        <w:t>svchost.exe</w:t>
       </w:r>
       <w:r>
         <w:rPr>
           <w:b w:val="0"/>
         </w:rPr>
-        <w:t>: open the web UI.</w:t>
-      </w:r>
-    </w:p>
-    <w:p>
-      <w:pPr>
-        <w:pStyle w:val="ListBullet"/>
-      </w:pPr>
+        <w:t xml:space="preserve"> with three rules: two HIGH (</w:t>
+      </w:r>
       <w:r>
         <w:rPr>
           <w:rFonts w:ascii="Consolas" w:hAnsi="Consolas"/>
@@ -1615,19 +2236,14 @@
           <w:color w:val="1A534A"/>
           <w:sz w:val="20"/>
         </w:rPr>
-        <w:t>python -m ctre gen sample_artifacts</w:t>
+        <w:t>SI_BEFORE_FN</w:t>
       </w:r>
       <w:r>
         <w:rPr>
           <w:b w:val="0"/>
         </w:rPr>
-        <w:t>: write the sample artifacts.</w:t>
-      </w:r>
-    </w:p>
-    <w:p>
-      <w:pPr>
-        <w:pStyle w:val="ListBullet"/>
-      </w:pPr>
+        <w:t xml:space="preserve">, </w:t>
+      </w:r>
       <w:r>
         <w:rPr>
           <w:rFonts w:ascii="Consolas" w:hAnsi="Consolas"/>
@@ -1635,13 +2251,980 @@
           <w:color w:val="1A534A"/>
           <w:sz w:val="20"/>
         </w:rPr>
+        <w:t>SI_BEFORE_JRNL</w:t>
+      </w:r>
+      <w:r>
+        <w:rPr>
+          <w:b w:val="0"/>
+        </w:rPr>
+        <w:t>) and one MEDIUM (</w:t>
+      </w:r>
+      <w:r>
+        <w:rPr>
+          <w:rFonts w:ascii="Consolas" w:hAnsi="Consolas"/>
+          <w:b w:val="0"/>
+          <w:color w:val="1A534A"/>
+          <w:sz w:val="20"/>
+        </w:rPr>
+        <w:t>ZERO_SUBSECOND</w:t>
+      </w:r>
+      <w:r>
+        <w:rPr>
+          <w:b w:val="0"/>
+        </w:rPr>
+        <w:t>).</w:t>
+      </w:r>
+    </w:p>
+    <w:p>
+      <w:pPr>
+        <w:pStyle w:val="ListBullet"/>
+      </w:pPr>
+      <w:r>
+        <w:rPr>
+          <w:b w:val="0"/>
+        </w:rPr>
+        <w:t xml:space="preserve">Did </w:t>
+      </w:r>
+      <w:r>
+        <w:rPr>
+          <w:b/>
+        </w:rPr>
+        <w:t>not</w:t>
+      </w:r>
+      <w:r>
+        <w:rPr>
+          <w:b w:val="0"/>
+        </w:rPr>
+        <w:t xml:space="preserve"> flag the normal file (no false alarm).</w:t>
+      </w:r>
+    </w:p>
+    <w:p>
+      <w:pPr>
+        <w:pStyle w:val="ListBullet"/>
+      </w:pPr>
+      <w:r>
+        <w:rPr>
+          <w:b w:val="0"/>
+        </w:rPr>
+        <w:t>Linked the roughly 160 KB outbound transfer to the disk change for that file.</w:t>
+      </w:r>
+    </w:p>
+    <w:p>
+      <w:pPr>
+        <w:pStyle w:val="ListBullet"/>
+      </w:pPr>
+      <w:r>
+        <w:rPr>
+          <w:b w:val="0"/>
+        </w:rPr>
+        <w:t xml:space="preserve">The timeline tells the story: </w:t>
+      </w:r>
+      <w:r>
+        <w:rPr>
+          <w:rFonts w:ascii="Consolas" w:hAnsi="Consolas"/>
+          <w:b w:val="0"/>
+          <w:color w:val="1A534A"/>
+          <w:sz w:val="20"/>
+        </w:rPr>
+        <w:t>svchost.exe</w:t>
+      </w:r>
+      <w:r>
+        <w:rPr>
+          <w:b w:val="0"/>
+        </w:rPr>
+        <w:t xml:space="preserve"> claims a 2019 creation in the MFT, the logbook records its real creation in the present, then a DNS lookup, a secure handshake, and the transfer to the outside host.</w:t>
+      </w:r>
+    </w:p>
+    <w:p>
+      <w:pPr>
+        <w:pStyle w:val="Heading2"/>
+      </w:pPr>
+      <w:r>
+        <w:t>Script</w:t>
+      </w:r>
+    </w:p>
+    <w:p>
+      <w:r>
+        <w:rPr>
+          <w:b w:val="0"/>
+        </w:rPr>
+        <w:t>"You run one command and this page opens. It is built to explain itself, so even a new user can follow it. I will click Load sample case, then Run analysis. Here is what it found: it caught the file we planted, flagged it with three separate rules, and left the normal file alone, which shows it is not just flagging everything. It also tied the data leaving the machine to the moment that file changed. The timeline reads like a story. And none of this is on trust: there are twenty automated tests that all pass, and we checked our network reader against a separate, well-known library to be sure the numbers are real. The app itself is safe to run: the server only listens on your own machine and has several guards so no website can reach it."</w:t>
+      </w:r>
+    </w:p>
+    <w:p>
+      <w:pPr>
+        <w:pStyle w:val="Heading2"/>
+      </w:pPr>
+      <w:r>
+        <w:t>Analogy</w:t>
+      </w:r>
+    </w:p>
+    <w:p>
+      <w:r>
+        <w:rPr>
+          <w:b w:val="0"/>
+        </w:rPr>
+        <w:t>If Kshitij and Moksh are the detectives, Aranck is the courtroom: the same findings, but now presented so anyone can follow them, with receipts (the tests) that prove the method works on a case where we already know the answer.</w:t>
+      </w:r>
+    </w:p>
+    <w:p>
+      <w:pPr>
+        <w:pStyle w:val="Heading2"/>
+      </w:pPr>
+      <w:r>
+        <w:t>If asked</w:t>
+      </w:r>
+    </w:p>
+    <w:p>
+      <w:pPr>
+        <w:pStyle w:val="ListBullet"/>
+      </w:pPr>
+      <w:r>
+        <w:rPr>
+          <w:b w:val="0"/>
+        </w:rPr>
+        <w:t>*Is running a local web server dangerous?* No. It is only reachable from your own machine and has the guards listed above.</w:t>
+      </w:r>
+    </w:p>
+    <w:p>
+      <w:pPr>
+        <w:pStyle w:val="ListBullet"/>
+      </w:pPr>
+      <w:r>
+        <w:rPr>
+          <w:b w:val="0"/>
+        </w:rPr>
+        <w:t>*How confident are you in the results?* The pipeline is proven end to end on controlled data where we know the right answer. It has not yet been measured on real intrusions; that is the honest next step.</w:t>
+      </w:r>
+    </w:p>
+    <w:p>
+      <w:pPr>
+        <w:pStyle w:val="ListBullet"/>
+      </w:pPr>
+      <w:r>
+        <w:rPr>
+          <w:b w:val="0"/>
+        </w:rPr>
+        <w:t>*What does "all tests pass" really prove?* That each part behaves correctly on known inputs and that the whole chain works from upload to downloaded report. It is strong evidence of correctness, not a formal security proof.</w:t>
+      </w:r>
+    </w:p>
+    <w:p>
+      <w:pPr>
+        <w:pBdr>
+          <w:bottom w:val="single" w:sz="6" w:space="1" w:color="999999"/>
+        </w:pBdr>
+      </w:pPr>
+    </w:p>
+    <w:p>
+      <w:pPr>
+        <w:pStyle w:val="Heading1"/>
+      </w:pPr>
+      <w:r>
+        <w:t>Live demo runbook (one person drives, the rest answer)</w:t>
+      </w:r>
+    </w:p>
+    <w:p>
+      <w:pPr>
+        <w:pStyle w:val="ListNumber"/>
+      </w:pPr>
+      <w:r>
+        <w:rPr>
+          <w:b w:val="0"/>
+        </w:rPr>
+        <w:t xml:space="preserve">Run </w:t>
+      </w:r>
+      <w:r>
+        <w:rPr>
+          <w:rFonts w:ascii="Consolas" w:hAnsi="Consolas"/>
+          <w:b w:val="0"/>
+          <w:color w:val="1A534A"/>
+          <w:sz w:val="20"/>
+        </w:rPr>
+        <w:t>python -m ctre</w:t>
+      </w:r>
+      <w:r>
+        <w:rPr>
+          <w:b w:val="0"/>
+        </w:rPr>
+        <w:t xml:space="preserve"> to open the web page.</w:t>
+      </w:r>
+    </w:p>
+    <w:p>
+      <w:pPr>
+        <w:pStyle w:val="ListNumber"/>
+      </w:pPr>
+      <w:r>
+        <w:rPr>
+          <w:b w:val="0"/>
+        </w:rPr>
+        <w:t xml:space="preserve">Click </w:t>
+      </w:r>
+      <w:r>
+        <w:rPr>
+          <w:b/>
+        </w:rPr>
+        <w:t>Load sample case</w:t>
+      </w:r>
+      <w:r>
+        <w:rPr>
+          <w:b w:val="0"/>
+        </w:rPr>
+        <w:t xml:space="preserve">, then </w:t>
+      </w:r>
+      <w:r>
+        <w:rPr>
+          <w:b/>
+        </w:rPr>
+        <w:t>Run analysis</w:t>
+      </w:r>
+      <w:r>
+        <w:rPr>
+          <w:b w:val="0"/>
+        </w:rPr>
+        <w:t>.</w:t>
+      </w:r>
+    </w:p>
+    <w:p>
+      <w:pPr>
+        <w:pStyle w:val="ListNumber"/>
+      </w:pPr>
+      <w:r>
+        <w:rPr>
+          <w:b w:val="0"/>
+        </w:rPr>
+        <w:t xml:space="preserve">Read the </w:t>
+      </w:r>
+      <w:r>
+        <w:rPr>
+          <w:b/>
+        </w:rPr>
+        <w:t>What the engine found</w:t>
+      </w:r>
+      <w:r>
+        <w:rPr>
+          <w:b w:val="0"/>
+        </w:rPr>
+        <w:t xml:space="preserve"> summary out loud.</w:t>
+      </w:r>
+    </w:p>
+    <w:p>
+      <w:pPr>
+        <w:pStyle w:val="ListNumber"/>
+      </w:pPr>
+      <w:r>
+        <w:rPr>
+          <w:b w:val="0"/>
+        </w:rPr>
+        <w:t xml:space="preserve">Scroll to the </w:t>
+      </w:r>
+      <w:r>
+        <w:rPr>
+          <w:b/>
+        </w:rPr>
+        <w:t>findings</w:t>
+      </w:r>
+      <w:r>
+        <w:rPr>
+          <w:b w:val="0"/>
+        </w:rPr>
+        <w:t xml:space="preserve"> and point out the two HIGH rules on </w:t>
+      </w:r>
+      <w:r>
+        <w:rPr>
+          <w:rFonts w:ascii="Consolas" w:hAnsi="Consolas"/>
+          <w:b w:val="0"/>
+          <w:color w:val="1A534A"/>
+          <w:sz w:val="20"/>
+        </w:rPr>
+        <w:t>svchost.exe</w:t>
+      </w:r>
+      <w:r>
+        <w:rPr>
+          <w:b w:val="0"/>
+        </w:rPr>
+        <w:t>.</w:t>
+      </w:r>
+    </w:p>
+    <w:p>
+      <w:pPr>
+        <w:pStyle w:val="ListNumber"/>
+      </w:pPr>
+      <w:r>
+        <w:rPr>
+          <w:b w:val="0"/>
+        </w:rPr>
+        <w:t xml:space="preserve">Scroll to the </w:t>
+      </w:r>
+      <w:r>
+        <w:rPr>
+          <w:b/>
+        </w:rPr>
+        <w:t>correlation</w:t>
+      </w:r>
+      <w:r>
+        <w:rPr>
+          <w:b w:val="0"/>
+        </w:rPr>
+        <w:t xml:space="preserve"> and then the </w:t>
+      </w:r>
+      <w:r>
+        <w:rPr>
+          <w:b/>
+        </w:rPr>
+        <w:t>timeline</w:t>
+      </w:r>
+      <w:r>
+        <w:rPr>
+          <w:b w:val="0"/>
+        </w:rPr>
+        <w:t>.</w:t>
+      </w:r>
+    </w:p>
+    <w:p>
+      <w:pPr>
+        <w:pStyle w:val="ListNumber"/>
+      </w:pPr>
+      <w:r>
+        <w:rPr>
+          <w:b w:val="0"/>
+        </w:rPr>
+        <w:t>Toggle the timeline source filters to show disk versus network events.</w:t>
+      </w:r>
+    </w:p>
+    <w:p>
+      <w:pPr>
+        <w:pStyle w:val="ListNumber"/>
+      </w:pPr>
+      <w:r>
+        <w:rPr>
+          <w:b w:val="0"/>
+        </w:rPr>
+        <w:t xml:space="preserve">Click </w:t>
+      </w:r>
+      <w:r>
+        <w:rPr>
+          <w:b/>
+        </w:rPr>
+        <w:t>Download HTML report</w:t>
+      </w:r>
+      <w:r>
+        <w:rPr>
+          <w:b w:val="0"/>
+        </w:rPr>
+        <w:t xml:space="preserve"> to show the shareable output.</w:t>
+      </w:r>
+    </w:p>
+    <w:p>
+      <w:r>
+        <w:rPr>
+          <w:b w:val="0"/>
+        </w:rPr>
+        <w:t>If anything fails live, fall back to the screenshots and the report PDF.</w:t>
+      </w:r>
+    </w:p>
+    <w:p>
+      <w:pPr>
+        <w:pStyle w:val="Heading1"/>
+      </w:pPr>
+      <w:r>
+        <w:t>Who owns which files (quick appendix)</w:t>
+      </w:r>
+    </w:p>
+    <w:p>
+      <w:pPr>
+        <w:pStyle w:val="ListBullet"/>
+      </w:pPr>
+      <w:r>
+        <w:rPr>
+          <w:b/>
+        </w:rPr>
+        <w:t>Vivek</w:t>
+      </w:r>
+      <w:r>
+        <w:rPr>
+          <w:b w:val="0"/>
+        </w:rPr>
+        <w:t xml:space="preserve">: the big picture; coordinator </w:t>
+      </w:r>
+      <w:r>
+        <w:rPr>
+          <w:rFonts w:ascii="Consolas" w:hAnsi="Consolas"/>
+          <w:b w:val="0"/>
+          <w:color w:val="1A534A"/>
+          <w:sz w:val="20"/>
+        </w:rPr>
+        <w:t>ctre/service.py</w:t>
+      </w:r>
+      <w:r>
+        <w:rPr>
+          <w:b w:val="0"/>
+        </w:rPr>
+        <w:t xml:space="preserve">, command line </w:t>
+      </w:r>
+      <w:r>
+        <w:rPr>
+          <w:rFonts w:ascii="Consolas" w:hAnsi="Consolas"/>
+          <w:b w:val="0"/>
+          <w:color w:val="1A534A"/>
+          <w:sz w:val="20"/>
+        </w:rPr>
+        <w:t>ctre/cli.py</w:t>
+      </w:r>
+      <w:r>
+        <w:rPr>
+          <w:b w:val="0"/>
+        </w:rPr>
+        <w:t>.</w:t>
+      </w:r>
+    </w:p>
+    <w:p>
+      <w:pPr>
+        <w:pStyle w:val="ListBullet"/>
+      </w:pPr>
+      <w:r>
+        <w:rPr>
+          <w:b/>
+        </w:rPr>
+        <w:t>Kshitij</w:t>
+      </w:r>
+      <w:r>
+        <w:rPr>
+          <w:b w:val="0"/>
+        </w:rPr>
+        <w:t xml:space="preserve">: </w:t>
+      </w:r>
+      <w:r>
+        <w:rPr>
+          <w:rFonts w:ascii="Consolas" w:hAnsi="Consolas"/>
+          <w:b w:val="0"/>
+          <w:color w:val="1A534A"/>
+          <w:sz w:val="20"/>
+        </w:rPr>
+        <w:t>ctre/filetime.py</w:t>
+      </w:r>
+      <w:r>
+        <w:rPr>
+          <w:b w:val="0"/>
+        </w:rPr>
+        <w:t xml:space="preserve">, </w:t>
+      </w:r>
+      <w:r>
+        <w:rPr>
+          <w:rFonts w:ascii="Consolas" w:hAnsi="Consolas"/>
+          <w:b w:val="0"/>
+          <w:color w:val="1A534A"/>
+          <w:sz w:val="20"/>
+        </w:rPr>
+        <w:t>ctre/mft.py</w:t>
+      </w:r>
+      <w:r>
+        <w:rPr>
+          <w:b w:val="0"/>
+        </w:rPr>
+        <w:t xml:space="preserve">, </w:t>
+      </w:r>
+      <w:r>
+        <w:rPr>
+          <w:rFonts w:ascii="Consolas" w:hAnsi="Consolas"/>
+          <w:b w:val="0"/>
+          <w:color w:val="1A534A"/>
+          <w:sz w:val="20"/>
+        </w:rPr>
+        <w:t>ctre/usnjrnl.py</w:t>
+      </w:r>
+      <w:r>
+        <w:rPr>
+          <w:b w:val="0"/>
+        </w:rPr>
+        <w:t xml:space="preserve">, </w:t>
+      </w:r>
+      <w:r>
+        <w:rPr>
+          <w:rFonts w:ascii="Consolas" w:hAnsi="Consolas"/>
+          <w:b w:val="0"/>
+          <w:color w:val="1A534A"/>
+          <w:sz w:val="20"/>
+        </w:rPr>
+        <w:t>ctre/timestomp.py</w:t>
+      </w:r>
+      <w:r>
+        <w:rPr>
+          <w:b w:val="0"/>
+        </w:rPr>
+        <w:t>.</w:t>
+      </w:r>
+    </w:p>
+    <w:p>
+      <w:pPr>
+        <w:pStyle w:val="ListBullet"/>
+      </w:pPr>
+      <w:r>
+        <w:rPr>
+          <w:b/>
+        </w:rPr>
+        <w:t>Moksh</w:t>
+      </w:r>
+      <w:r>
+        <w:rPr>
+          <w:b w:val="0"/>
+        </w:rPr>
+        <w:t xml:space="preserve">: </w:t>
+      </w:r>
+      <w:r>
+        <w:rPr>
+          <w:rFonts w:ascii="Consolas" w:hAnsi="Consolas"/>
+          <w:b w:val="0"/>
+          <w:color w:val="1A534A"/>
+          <w:sz w:val="20"/>
+        </w:rPr>
+        <w:t>ctre/pcap_meta.py</w:t>
+      </w:r>
+      <w:r>
+        <w:rPr>
+          <w:b w:val="0"/>
+        </w:rPr>
+        <w:t xml:space="preserve">, </w:t>
+      </w:r>
+      <w:r>
+        <w:rPr>
+          <w:rFonts w:ascii="Consolas" w:hAnsi="Consolas"/>
+          <w:b w:val="0"/>
+          <w:color w:val="1A534A"/>
+          <w:sz w:val="20"/>
+        </w:rPr>
+        <w:t>ctre/correlate.py</w:t>
+      </w:r>
+      <w:r>
+        <w:rPr>
+          <w:b w:val="0"/>
+        </w:rPr>
+        <w:t>.</w:t>
+      </w:r>
+    </w:p>
+    <w:p>
+      <w:pPr>
+        <w:pStyle w:val="ListBullet"/>
+      </w:pPr>
+      <w:r>
+        <w:rPr>
+          <w:b/>
+        </w:rPr>
+        <w:t>Aranck</w:t>
+      </w:r>
+      <w:r>
+        <w:rPr>
+          <w:b w:val="0"/>
+        </w:rPr>
+        <w:t xml:space="preserve">: </w:t>
+      </w:r>
+      <w:r>
+        <w:rPr>
+          <w:rFonts w:ascii="Consolas" w:hAnsi="Consolas"/>
+          <w:b w:val="0"/>
+          <w:color w:val="1A534A"/>
+          <w:sz w:val="20"/>
+        </w:rPr>
+        <w:t>ctre/web.py</w:t>
+      </w:r>
+      <w:r>
+        <w:rPr>
+          <w:b w:val="0"/>
+        </w:rPr>
+        <w:t xml:space="preserve">, </w:t>
+      </w:r>
+      <w:r>
+        <w:rPr>
+          <w:rFonts w:ascii="Consolas" w:hAnsi="Consolas"/>
+          <w:b w:val="0"/>
+          <w:color w:val="1A534A"/>
+          <w:sz w:val="20"/>
+        </w:rPr>
+        <w:t>ctre/web/</w:t>
+      </w:r>
+      <w:r>
+        <w:rPr>
+          <w:b w:val="0"/>
+        </w:rPr>
+        <w:t xml:space="preserve">, </w:t>
+      </w:r>
+      <w:r>
+        <w:rPr>
+          <w:rFonts w:ascii="Consolas" w:hAnsi="Consolas"/>
+          <w:b w:val="0"/>
+          <w:color w:val="1A534A"/>
+          <w:sz w:val="20"/>
+        </w:rPr>
+        <w:t>ctre/report.py</w:t>
+      </w:r>
+      <w:r>
+        <w:rPr>
+          <w:b w:val="0"/>
+        </w:rPr>
+        <w:t xml:space="preserve">, </w:t>
+      </w:r>
+      <w:r>
+        <w:rPr>
+          <w:rFonts w:ascii="Consolas" w:hAnsi="Consolas"/>
+          <w:b w:val="0"/>
+          <w:color w:val="1A534A"/>
+          <w:sz w:val="20"/>
+        </w:rPr>
+        <w:t>ctre/gen_testdata.py</w:t>
+      </w:r>
+      <w:r>
+        <w:rPr>
+          <w:b w:val="0"/>
+        </w:rPr>
+        <w:t xml:space="preserve">, </w:t>
+      </w:r>
+      <w:r>
+        <w:rPr>
+          <w:rFonts w:ascii="Consolas" w:hAnsi="Consolas"/>
+          <w:b w:val="0"/>
+          <w:color w:val="1A534A"/>
+          <w:sz w:val="20"/>
+        </w:rPr>
+        <w:t>tests/</w:t>
+      </w:r>
+      <w:r>
+        <w:rPr>
+          <w:b w:val="0"/>
+        </w:rPr>
+        <w:t>.</w:t>
+      </w:r>
+    </w:p>
+    <w:p>
+      <w:pPr>
+        <w:pStyle w:val="Heading1"/>
+      </w:pPr>
+      <w:r>
+        <w:t>Glossary (plain language)</w:t>
+      </w:r>
+    </w:p>
+    <w:p>
+      <w:pPr>
+        <w:pStyle w:val="ListBullet"/>
+      </w:pPr>
+      <w:r>
+        <w:rPr>
+          <w:b/>
+        </w:rPr>
+        <w:t>DFIR</w:t>
+      </w:r>
+      <w:r>
+        <w:rPr>
+          <w:b w:val="0"/>
+        </w:rPr>
+        <w:t>: digital forensics and incident response; investigating a computer attack from collected evidence.</w:t>
+      </w:r>
+    </w:p>
+    <w:p>
+      <w:pPr>
+        <w:pStyle w:val="ListBullet"/>
+      </w:pPr>
+      <w:r>
+        <w:rPr>
+          <w:b/>
+        </w:rPr>
+        <w:t>NTFS</w:t>
+      </w:r>
+      <w:r>
+        <w:rPr>
+          <w:b w:val="0"/>
+        </w:rPr>
+        <w:t>: the file system Windows uses to organize files on a disk.</w:t>
+      </w:r>
+    </w:p>
+    <w:p>
+      <w:pPr>
+        <w:pStyle w:val="ListBullet"/>
+      </w:pPr>
+      <w:r>
+        <w:rPr>
+          <w:b/>
+        </w:rPr>
+        <w:t>MFT</w:t>
+      </w:r>
+      <w:r>
+        <w:rPr>
+          <w:b w:val="0"/>
+        </w:rPr>
+        <w:t>: NTFS's master index; one entry per file, holding its timestamps.</w:t>
+      </w:r>
+    </w:p>
+    <w:p>
+      <w:pPr>
+        <w:pStyle w:val="ListBullet"/>
+      </w:pPr>
+      <w:r>
+        <w:rPr>
+          <w:b/>
+        </w:rPr>
+        <w:t>SI / FN</w:t>
+      </w:r>
+      <w:r>
+        <w:rPr>
+          <w:b w:val="0"/>
+        </w:rPr>
+        <w:t>: a file's two timestamp sets; SI is easy to fake, FN is hard.</w:t>
+      </w:r>
+    </w:p>
+    <w:p>
+      <w:pPr>
+        <w:pStyle w:val="ListBullet"/>
+      </w:pPr>
+      <w:r>
+        <w:rPr>
+          <w:b/>
+        </w:rPr>
+        <w:t>Change journal (`$UsnJrnl`)</w:t>
+      </w:r>
+      <w:r>
+        <w:rPr>
+          <w:b w:val="0"/>
+        </w:rPr>
+        <w:t>: NTFS's append-only logbook of file changes.</w:t>
+      </w:r>
+    </w:p>
+    <w:p>
+      <w:pPr>
+        <w:pStyle w:val="ListBullet"/>
+      </w:pPr>
+      <w:r>
+        <w:rPr>
+          <w:b/>
+        </w:rPr>
+        <w:t>Timestamp / FILETIME</w:t>
+      </w:r>
+      <w:r>
+        <w:rPr>
+          <w:b w:val="0"/>
+        </w:rPr>
+        <w:t>: when a file was created or changed; Windows stores it in a special counting format that we convert to normal dates.</w:t>
+      </w:r>
+    </w:p>
+    <w:p>
+      <w:pPr>
+        <w:pStyle w:val="ListBullet"/>
+      </w:pPr>
+      <w:r>
+        <w:rPr>
+          <w:b/>
+        </w:rPr>
+        <w:t>Timestomping</w:t>
+      </w:r>
+      <w:r>
+        <w:rPr>
+          <w:b w:val="0"/>
+        </w:rPr>
+        <w:t>: faking a file's timestamps to make it look old and trusted.</w:t>
+      </w:r>
+    </w:p>
+    <w:p>
+      <w:pPr>
+        <w:pStyle w:val="ListBullet"/>
+      </w:pPr>
+      <w:r>
+        <w:rPr>
+          <w:b/>
+        </w:rPr>
+        <w:t>Packet / pcap</w:t>
+      </w:r>
+      <w:r>
+        <w:rPr>
+          <w:b w:val="0"/>
+        </w:rPr>
+        <w:t>: a chunk of network data; a pcap is a saved recording of them.</w:t>
+      </w:r>
+    </w:p>
+    <w:p>
+      <w:pPr>
+        <w:pStyle w:val="ListBullet"/>
+      </w:pPr>
+      <w:r>
+        <w:rPr>
+          <w:b/>
+        </w:rPr>
+        <w:t>Flow</w:t>
+      </w:r>
+      <w:r>
+        <w:rPr>
+          <w:b w:val="0"/>
+        </w:rPr>
+        <w:t>: one network conversation, summarized by who, ports, timing, and size.</w:t>
+      </w:r>
+    </w:p>
+    <w:p>
+      <w:pPr>
+        <w:pStyle w:val="ListBullet"/>
+      </w:pPr>
+      <w:r>
+        <w:rPr>
+          <w:b/>
+        </w:rPr>
+        <w:t>DNS</w:t>
+      </w:r>
+      <w:r>
+        <w:rPr>
+          <w:b w:val="0"/>
+        </w:rPr>
+        <w:t>: the system that turns a website name into an address; the names are visible even with encryption.</w:t>
+      </w:r>
+    </w:p>
+    <w:p>
+      <w:pPr>
+        <w:pStyle w:val="ListBullet"/>
+      </w:pPr>
+      <w:r>
+        <w:rPr>
+          <w:b/>
+        </w:rPr>
+        <w:t>SNI</w:t>
+      </w:r>
+      <w:r>
+        <w:rPr>
+          <w:b w:val="0"/>
+        </w:rPr>
+        <w:t>: the server name sent in the clear at the start of a secure connection.</w:t>
+      </w:r>
+    </w:p>
+    <w:p>
+      <w:pPr>
+        <w:pStyle w:val="ListBullet"/>
+      </w:pPr>
+      <w:r>
+        <w:rPr>
+          <w:b/>
+        </w:rPr>
+        <w:t>Encryption</w:t>
+      </w:r>
+      <w:r>
+        <w:rPr>
+          <w:b w:val="0"/>
+        </w:rPr>
+        <w:t>: scrambling data so only the two ends can read it.</w:t>
+      </w:r>
+    </w:p>
+    <w:p>
+      <w:pPr>
+        <w:pStyle w:val="ListBullet"/>
+      </w:pPr>
+      <w:r>
+        <w:rPr>
+          <w:b/>
+        </w:rPr>
+        <w:t>Exfiltration</w:t>
+      </w:r>
+      <w:r>
+        <w:rPr>
+          <w:b w:val="0"/>
+        </w:rPr>
+        <w:t>: stealing data by sending it off the machine.</w:t>
+      </w:r>
+    </w:p>
+    <w:p>
+      <w:pPr>
+        <w:pStyle w:val="ListBullet"/>
+      </w:pPr>
+      <w:r>
+        <w:rPr>
+          <w:b/>
+        </w:rPr>
+        <w:t>Offline / read-only</w:t>
+      </w:r>
+      <w:r>
+        <w:rPr>
+          <w:b w:val="0"/>
+        </w:rPr>
+        <w:t>: working on copies without changing the evidence.</w:t>
+      </w:r>
+    </w:p>
+    <w:p>
+      <w:pPr>
+        <w:pStyle w:val="Heading1"/>
+      </w:pPr>
+      <w:r>
+        <w:t>Commands</w:t>
+      </w:r>
+    </w:p>
+    <w:p>
+      <w:pPr>
+        <w:pStyle w:val="ListBullet"/>
+      </w:pPr>
+      <w:r>
+        <w:rPr>
+          <w:rFonts w:ascii="Consolas" w:hAnsi="Consolas"/>
+          <w:b w:val="0"/>
+          <w:color w:val="1A534A"/>
+          <w:sz w:val="20"/>
+        </w:rPr>
+        <w:t>python -m ctre</w:t>
+      </w:r>
+      <w:r>
+        <w:rPr>
+          <w:b w:val="0"/>
+        </w:rPr>
+        <w:t xml:space="preserve"> - open the web app.</w:t>
+      </w:r>
+    </w:p>
+    <w:p>
+      <w:pPr>
+        <w:pStyle w:val="ListBullet"/>
+      </w:pPr>
+      <w:r>
+        <w:rPr>
+          <w:rFonts w:ascii="Consolas" w:hAnsi="Consolas"/>
+          <w:b w:val="0"/>
+          <w:color w:val="1A534A"/>
+          <w:sz w:val="20"/>
+        </w:rPr>
+        <w:t>python -m ctre gen sample_artifacts</w:t>
+      </w:r>
+      <w:r>
+        <w:rPr>
+          <w:b w:val="0"/>
+        </w:rPr>
+        <w:t xml:space="preserve"> - write the sample artifacts.</w:t>
+      </w:r>
+    </w:p>
+    <w:p>
+      <w:pPr>
+        <w:pStyle w:val="ListBullet"/>
+      </w:pPr>
+      <w:r>
+        <w:rPr>
+          <w:rFonts w:ascii="Consolas" w:hAnsi="Consolas"/>
+          <w:b w:val="0"/>
+          <w:color w:val="1A534A"/>
+          <w:sz w:val="20"/>
+        </w:rPr>
+        <w:t>python -m ctre analyze --mft ... --usnjrnl ... --pcap ... --report out.html</w:t>
+      </w:r>
+      <w:r>
+        <w:rPr>
+          <w:b w:val="0"/>
+        </w:rPr>
+        <w:t xml:space="preserve"> - run from the command line.</w:t>
+      </w:r>
+    </w:p>
+    <w:p>
+      <w:pPr>
+        <w:pStyle w:val="ListBullet"/>
+      </w:pPr>
+      <w:r>
+        <w:rPr>
+          <w:rFonts w:ascii="Consolas" w:hAnsi="Consolas"/>
+          <w:b w:val="0"/>
+          <w:color w:val="1A534A"/>
+          <w:sz w:val="20"/>
+        </w:rPr>
         <w:t>python -m pytest -q</w:t>
       </w:r>
       <w:r>
         <w:rPr>
           <w:b w:val="0"/>
         </w:rPr>
-        <w:t>: run the test suite.</w:t>
+        <w:t xml:space="preserve"> - run the 20 tests.</w:t>
       </w:r>
     </w:p>
     <w:sectPr>

</xml_diff>